<commit_message>
docs: generate refined Word (.docx) & pixel-perfect PDF (.pdf) IEEE TSMC papers with strict margin-aligned tables
</commit_message>
<xml_diff>
--- a/IEEE_TSMC_5D_Mind_Model_Paper_EN_DoubleBlind.docx
+++ b/IEEE_TSMC_5D_Mind_Model_Paper_EN_DoubleBlind.docx
@@ -4,711 +4,1668 @@
   <w:body>
     <w:p>
       <w:pPr>
+        <w:keepNext/>
+        <w:spacing w:before="320" w:after="160"/>
         <w:jc w:val="center"/>
       </w:pPr>
       <w:r>
         <w:rPr>
           <w:rFonts w:ascii="Times New Roman" w:hAnsi="Times New Roman"/>
           <w:b/>
-          <w:color w:val="003366"/>
-          <w:sz w:val="32"/>
+          <w:color w:val="1B365D"/>
+          <w:sz w:val="36"/>
         </w:rPr>
         <w:t>Conscience-Driven Holographic Metacognition: A Second-Order Cybernetic Architecture and 5D Mind Model for Open Complex Giant Systems</w:t>
       </w:r>
     </w:p>
     <w:p>
       <w:pPr>
+        <w:keepNext/>
+        <w:spacing w:before="280" w:after="120"/>
+      </w:pPr>
+      <w:r>
+        <w:rPr>
+          <w:rFonts w:ascii="Times New Roman" w:hAnsi="Times New Roman"/>
+          <w:b/>
+          <w:color w:val="1B365D"/>
+          <w:sz w:val="27"/>
+        </w:rPr>
+        <w:t>Abstract</w:t>
+      </w:r>
+    </w:p>
+    <w:p>
+      <w:pPr>
+        <w:spacing w:after="100" w:line="288" w:lineRule="auto"/>
+      </w:pPr>
+      <w:r>
+        <w:t>To address the empirical anomalies of free energy divergence (</w:t>
+      </w:r>
+      <w:r>
+        <w:rPr>
+          <w:rFonts w:ascii="Times New Roman" w:hAnsi="Times New Roman"/>
+          <w:i/>
+          <w:color w:val="1B365D"/>
+        </w:rPr>
+        <w:t>\nabla_{\vartheta} \mathcal{F} \to \infty</w:t>
+      </w:r>
+      <w:r>
+        <w:t>), Gödelian self-referential paralysis, and Goodhart heavy-tailed collapse (</w:t>
+      </w:r>
+      <w:r>
+        <w:rPr>
+          <w:rFonts w:ascii="Times New Roman" w:hAnsi="Times New Roman"/>
+          <w:i/>
+          <w:color w:val="1B365D"/>
+        </w:rPr>
+        <w:t>\alpha &lt; 2</w:t>
+      </w:r>
+      <w:r>
+        <w:t xml:space="preserve">) encountered by Open Complex Giant Systems (OCGS) and Large Language Models (LLMs) at Out-of-Distribution (OOD) zero-shot deadlocks, this paper proposes a self-consistent </w:t>
+      </w:r>
+      <w:r>
+        <w:rPr>
+          <w:b/>
+          <w:color w:val="1B365D"/>
+        </w:rPr>
+        <w:t>Second-Order Cybernetic Architecture and 5D Mind Model</w:t>
+      </w:r>
+      <w:r>
+        <w:t>.</w:t>
+      </w:r>
+    </w:p>
+    <w:p>
+      <w:pPr>
+        <w:spacing w:after="100" w:line="288" w:lineRule="auto"/>
+      </w:pPr>
+      <w:r>
+        <w:t>We formally prove that the five cognitive control operators—Homeostatic Compact-Support Damping (</w:t>
+      </w:r>
+      <w:r>
+        <w:rPr>
+          <w:rFonts w:ascii="Times New Roman" w:hAnsi="Times New Roman"/>
+          <w:i/>
+          <w:color w:val="1B365D"/>
+        </w:rPr>
+        <w:t>E_{\text{supp}}</w:t>
+      </w:r>
+      <w:r>
+        <w:t>), Residual Sensitivity (</w:t>
+      </w:r>
+      <w:r>
+        <w:rPr>
+          <w:rFonts w:ascii="Times New Roman" w:hAnsi="Times New Roman"/>
+          <w:i/>
+          <w:color w:val="1B365D"/>
+        </w:rPr>
+        <w:t>\nabla R</w:t>
+      </w:r>
+      <w:r>
+        <w:t>), Tacit Sensitivity Buffer (</w:t>
+      </w:r>
+      <w:r>
+        <w:rPr>
+          <w:rFonts w:ascii="Times New Roman" w:hAnsi="Times New Roman"/>
+          <w:i/>
+          <w:color w:val="1B365D"/>
+        </w:rPr>
+        <w:t>\mathcal{S}_{\text{buff}}</w:t>
+      </w:r>
+      <w:r>
+        <w:t>), Fluid Algebra Solver (</w:t>
+      </w:r>
+      <w:r>
+        <w:rPr>
+          <w:rFonts w:ascii="Times New Roman" w:hAnsi="Times New Roman"/>
+          <w:i/>
+          <w:color w:val="1B365D"/>
+        </w:rPr>
+        <w:t>\hat{\mathcal{A}}_{\text{fluid}}</w:t>
+      </w:r>
+      <w:r>
+        <w:t>), and Second-Order Metacognitive Revision (</w:t>
+      </w:r>
+      <w:r>
+        <w:rPr>
+          <w:rFonts w:ascii="Times New Roman" w:hAnsi="Times New Roman"/>
+          <w:i/>
+          <w:color w:val="1B365D"/>
+        </w:rPr>
+        <w:t>\hat{\Omega}_{\text{meta}}</w:t>
+      </w:r>
+      <w:r>
+        <w:t xml:space="preserve">)—form a minimal complete orthogonal basis for controlling entropy expansion in </w:t>
+      </w:r>
+      <w:r>
+        <w:rPr>
+          <w:rFonts w:ascii="Times New Roman" w:hAnsi="Times New Roman"/>
+          <w:i/>
+          <w:color w:val="1B365D"/>
+        </w:rPr>
+        <w:t>\mathcal{O}(N!)</w:t>
+      </w:r>
+      <w:r>
+        <w:t xml:space="preserve"> phase spaces. We formalize the system as a </w:t>
+      </w:r>
+      <w:r>
+        <w:rPr>
+          <w:b/>
+          <w:color w:val="1B365D"/>
+        </w:rPr>
+        <w:t>Hybrid Second-Order Cybernetic Automaton 7-Tuple</w:t>
+      </w:r>
+      <w:r>
+        <w:t xml:space="preserve"> </w:t>
+      </w:r>
+      <w:r>
+        <w:rPr>
+          <w:rFonts w:ascii="Times New Roman" w:hAnsi="Times New Roman"/>
+          <w:i/>
+          <w:color w:val="1B365D"/>
+        </w:rPr>
+        <w:t>\mathbf{H} = (Q, X, U, f, \text{Guard}, \text{Reset}, Y)</w:t>
+      </w:r>
+      <w:r>
+        <w:t xml:space="preserve">, featuring dimensionally consistent continuous differential equations (with damping gain </w:t>
+      </w:r>
+      <w:r>
+        <w:rPr>
+          <w:rFonts w:ascii="Times New Roman" w:hAnsi="Times New Roman"/>
+          <w:i/>
+          <w:color w:val="1B365D"/>
+        </w:rPr>
+        <w:t>\gamma_1 &gt; 0</w:t>
+      </w:r>
+      <w:r>
+        <w:t xml:space="preserve"> and Jacobian pull-back </w:t>
+      </w:r>
+      <w:r>
+        <w:rPr>
+          <w:rFonts w:ascii="Times New Roman" w:hAnsi="Times New Roman"/>
+          <w:i/>
+          <w:color w:val="1B365D"/>
+        </w:rPr>
+        <w:t>\left(\frac{\partial x}{\partial \theta}\right)^T \nabla_x V_{\text{supp}}</w:t>
+      </w:r>
+      <w:r>
+        <w:t>) and non-continuous Wasserstein-Fisher-Rao (WFR) geodesic manifold jumps.</w:t>
+      </w:r>
+    </w:p>
+    <w:p>
+      <w:pPr>
+        <w:spacing w:after="100" w:line="288" w:lineRule="auto"/>
+      </w:pPr>
+      <w:r>
+        <w:t xml:space="preserve">Three core mathematical theorems are established: (1) Endogenous derivation of activation threshold </w:t>
+      </w:r>
+      <w:r>
+        <w:rPr>
+          <w:rFonts w:ascii="Times New Roman" w:hAnsi="Times New Roman"/>
+          <w:i/>
+          <w:color w:val="1B365D"/>
+        </w:rPr>
+        <w:t>Z \ge +1.5\sigma</w:t>
+      </w:r>
+      <w:r>
+        <w:t xml:space="preserve"> and </w:t>
+      </w:r>
+      <w:r>
+        <w:rPr>
+          <w:rFonts w:ascii="Times New Roman" w:hAnsi="Times New Roman"/>
+          <w:i/>
+          <w:color w:val="1B365D"/>
+        </w:rPr>
+        <w:t>\text{SNR}_{\min} \ge 3.52\text{dB}</w:t>
+      </w:r>
+      <w:r>
+        <w:t xml:space="preserve"> based on Shannon-Ashby critical entropy explosion error bound </w:t>
+      </w:r>
+      <w:r>
+        <w:rPr>
+          <w:rFonts w:ascii="Times New Roman" w:hAnsi="Times New Roman"/>
+          <w:i/>
+          <w:color w:val="1B365D"/>
+        </w:rPr>
+        <w:t>P_{\text{error}} \le \frac{1}{2e} \approx 6.7\%</w:t>
+      </w:r>
+      <w:r>
+        <w:t xml:space="preserve">; (2) Theorem 0.2.1 formally proving the non-reducibility of </w:t>
+      </w:r>
+      <w:r>
+        <w:rPr>
+          <w:rFonts w:ascii="Times New Roman" w:hAnsi="Times New Roman"/>
+          <w:i/>
+          <w:color w:val="1B365D"/>
+        </w:rPr>
+        <w:t>\hat{\Omega}_{\text{meta}}</w:t>
+      </w:r>
+      <w:r>
+        <w:t xml:space="preserve"> to Active Inference Bayesian Model Reduction (BMR) and Non-parametric Hierarchical Bayes (HBM) due to infinite time complexity (</w:t>
+      </w:r>
+      <w:r>
+        <w:rPr>
+          <w:rFonts w:ascii="Times New Roman" w:hAnsi="Times New Roman"/>
+          <w:i/>
+          <w:color w:val="1B365D"/>
+        </w:rPr>
+        <w:t>\tau_{\text{HBM}} \to \infty</w:t>
+      </w:r>
+      <w:r>
+        <w:t xml:space="preserve">) when </w:t>
+      </w:r>
+      <w:r>
+        <w:rPr>
+          <w:rFonts w:ascii="Times New Roman" w:hAnsi="Times New Roman"/>
+          <w:i/>
+          <w:color w:val="1B365D"/>
+        </w:rPr>
+        <w:t>\operatorname{supp}(P_{\text{true}}) \cap \operatorname{supp}(P_{\text{prior}}) = \emptyset</w:t>
+      </w:r>
+      <w:r>
+        <w:t xml:space="preserve">; (3) Theorem 8.3.1 deriving the lower bound of incremental explained variance </w:t>
+      </w:r>
+      <w:r>
+        <w:rPr>
+          <w:rFonts w:ascii="Times New Roman" w:hAnsi="Times New Roman"/>
+          <w:i/>
+          <w:color w:val="1B365D"/>
+        </w:rPr>
+        <w:t>\Delta R^2 \ge 0.28</w:t>
+      </w:r>
+      <w:r>
+        <w:t xml:space="preserve"> (</w:t>
+      </w:r>
+      <w:r>
+        <w:rPr>
+          <w:rFonts w:ascii="Times New Roman" w:hAnsi="Times New Roman"/>
+          <w:i/>
+          <w:color w:val="1B365D"/>
+        </w:rPr>
+        <w:t>\text{OR} \ge 4.2</w:t>
+      </w:r>
+      <w:r>
+        <w:t xml:space="preserve">, Cohen's </w:t>
+      </w:r>
+      <w:r>
+        <w:rPr>
+          <w:rFonts w:ascii="Times New Roman" w:hAnsi="Times New Roman"/>
+          <w:i/>
+          <w:color w:val="1B365D"/>
+        </w:rPr>
+        <w:t>f^2 \ge 0.35</w:t>
+      </w:r>
+      <w:r>
+        <w:t>) over Big Five trait models based on Fisher-Rao orthogonal projection geometry.</w:t>
+      </w:r>
+    </w:p>
+    <w:p>
+      <w:pPr>
+        <w:spacing w:after="100" w:line="288" w:lineRule="auto"/>
+      </w:pPr>
+      <w:r>
+        <w:t xml:space="preserve">A cross-layer functional isomorphism matrix with evidence grades and a 4-tier falsifiability decision tree are established, and bus-level hardware fuse topology is validated on 5D-Mind-Bench (false positive rate </w:t>
+      </w:r>
+      <w:r>
+        <w:rPr>
+          <w:rFonts w:ascii="Times New Roman" w:hAnsi="Times New Roman"/>
+          <w:i/>
+          <w:color w:val="1B365D"/>
+        </w:rPr>
+        <w:t>&lt;1.5\%</w:t>
+      </w:r>
+      <w:r>
+        <w:t xml:space="preserve">, OOD jump rate </w:t>
+      </w:r>
+      <w:r>
+        <w:rPr>
+          <w:rFonts w:ascii="Times New Roman" w:hAnsi="Times New Roman"/>
+          <w:i/>
+          <w:color w:val="1B365D"/>
+        </w:rPr>
+        <w:t>88.4\%</w:t>
+      </w:r>
+      <w:r>
+        <w:t>).</w:t>
+      </w:r>
+    </w:p>
+    <w:p>
+      <w:pPr>
+        <w:spacing w:after="100" w:line="288" w:lineRule="auto"/>
+      </w:pPr>
+      <w:r/>
+      <w:r>
+        <w:rPr>
+          <w:b/>
+          <w:color w:val="1B365D"/>
+        </w:rPr>
+        <w:t>Keywords</w:t>
+      </w:r>
+      <w:r>
+        <w:t>: Second-Order Cybernetics; 5D Mind Model; Hybrid Automaton 7-Tuple; Wasserstein-Fisher-Rao Geodesics; Gödel Deadlock; 5D-Mind-Bench</w:t>
+      </w:r>
+    </w:p>
+    <w:p>
+      <w:pPr>
+        <w:spacing w:before="160" w:after="160"/>
+        <w:pBdr>
+          <w:bottom w:val="single" w:sz="6" w:space="1" w:color="D0D7DE"/>
+        </w:pBdr>
+      </w:pPr>
+    </w:p>
+    <w:p>
+      <w:pPr>
+        <w:keepNext/>
+        <w:spacing w:before="320" w:after="160"/>
+        <w:jc w:val="left"/>
+      </w:pPr>
+      <w:r>
+        <w:rPr>
+          <w:rFonts w:ascii="Times New Roman" w:hAnsi="Times New Roman"/>
+          <w:b/>
+          <w:color w:val="1B365D"/>
+          <w:sz w:val="36"/>
+        </w:rPr>
+        <w:t>I. Introduction and Phenomenological Cybernetic Foundations</w:t>
+      </w:r>
+    </w:p>
+    <w:p>
+      <w:pPr>
+        <w:keepNext/>
+        <w:spacing w:before="280" w:after="120"/>
+      </w:pPr>
+      <w:r>
+        <w:rPr>
+          <w:rFonts w:ascii="Times New Roman" w:hAnsi="Times New Roman"/>
+          <w:b/>
+          <w:color w:val="1B365D"/>
+          <w:sz w:val="27"/>
+        </w:rPr>
+        <w:t>1.1 Empirical Anomalies in Classical Cognitive Paradigms</w:t>
+      </w:r>
+    </w:p>
+    <w:p>
+      <w:pPr>
+        <w:spacing w:after="100" w:line="288" w:lineRule="auto"/>
+      </w:pPr>
+      <w:r>
+        <w:t>At OOD zero-shot deadlocks, classical cognitive architectures encounter insurmountable anomalies:</w:t>
+      </w:r>
+    </w:p>
+    <w:p>
+      <w:pPr>
+        <w:spacing w:after="100" w:line="288" w:lineRule="auto"/>
+      </w:pPr>
+      <w:r>
+        <w:t xml:space="preserve">1. </w:t>
+      </w:r>
+      <w:r>
+        <w:rPr>
+          <w:b/>
+          <w:color w:val="1B365D"/>
+        </w:rPr>
+        <w:t>Global Workspace Theory (GWT)</w:t>
+      </w:r>
+      <w:r>
+        <w:t>: Linear broadcasting mechanisms fail to explain how un-structured high-entropy data is abstracted and dimensionally reduced before ignition.</w:t>
+      </w:r>
+    </w:p>
+    <w:p>
+      <w:pPr>
+        <w:spacing w:after="100" w:line="288" w:lineRule="auto"/>
+      </w:pPr>
+      <w:r>
+        <w:t xml:space="preserve">2. </w:t>
+      </w:r>
+      <w:r>
+        <w:rPr>
+          <w:b/>
+          <w:color w:val="1B365D"/>
+        </w:rPr>
+        <w:t>Free Energy Principle (FEP / Active Inference)</w:t>
+      </w:r>
+      <w:r>
+        <w:t>: Variational inference is locked inside a fixed generative model manifold, suffering free energy divergence (</w:t>
+      </w:r>
+      <w:r>
+        <w:rPr>
+          <w:rFonts w:ascii="Times New Roman" w:hAnsi="Times New Roman"/>
+          <w:i/>
+          <w:color w:val="1B365D"/>
+        </w:rPr>
+        <w:t>\nabla_{\vartheta} \mathcal{F} \to \infty</w:t>
+      </w:r>
+      <w:r>
+        <w:t xml:space="preserve">) when </w:t>
+      </w:r>
+      <w:r>
+        <w:rPr>
+          <w:rFonts w:ascii="Times New Roman" w:hAnsi="Times New Roman"/>
+          <w:i/>
+          <w:color w:val="1B365D"/>
+        </w:rPr>
+        <w:t>y_{\text{true}} \notin \operatorname{supp}(P_{\text{prior}})</w:t>
+      </w:r>
+      <w:r>
+        <w:t>.</w:t>
+      </w:r>
+    </w:p>
+    <w:p>
+      <w:pPr>
+        <w:spacing w:after="100" w:line="288" w:lineRule="auto"/>
+      </w:pPr>
+      <w:r>
+        <w:t xml:space="preserve">3. </w:t>
+      </w:r>
+      <w:r>
+        <w:rPr>
+          <w:b/>
+          <w:color w:val="1B365D"/>
+        </w:rPr>
+        <w:t>Dual-Process Theory</w:t>
+      </w:r>
+      <w:r>
+        <w:t>: Coarse System 1 vs System 2 classification fails to separate 1st-order algebraic computation (dlPFC) from 2nd-order constitutional revision (BA10).</w:t>
+      </w:r>
+    </w:p>
+    <w:p>
+      <w:pPr>
+        <w:keepNext/>
+        <w:spacing w:before="280" w:after="120"/>
+      </w:pPr>
+      <w:r>
+        <w:rPr>
+          <w:rFonts w:ascii="Times New Roman" w:hAnsi="Times New Roman"/>
+          <w:b/>
+          <w:color w:val="1B365D"/>
+          <w:sz w:val="27"/>
+        </w:rPr>
+        <w:t>1.2 Phenomenological Origin and Dual Attribution</w:t>
+      </w:r>
+    </w:p>
+    <w:p>
+      <w:pPr>
+        <w:spacing w:after="100" w:line="288" w:lineRule="auto"/>
+      </w:pPr>
+      <w:r>
+        <w:t>Cognitive agency originates from capturing micro residuals (</w:t>
+      </w:r>
+      <w:r>
+        <w:rPr>
+          <w:rFonts w:ascii="Times New Roman" w:hAnsi="Times New Roman"/>
+          <w:i/>
+          <w:color w:val="1B365D"/>
+        </w:rPr>
+        <w:t>\nabla R = Y_{\text{real}} - Y_{\text{plan}}</w:t>
+      </w:r>
+      <w:r>
+        <w:t>). When a residual is detected, a dual attribution judgment is triggered:</w:t>
+      </w:r>
+    </w:p>
+    <w:p>
+      <w:pPr>
+        <w:spacing w:after="80"/>
+        <w:ind w:left="360"/>
+      </w:pPr>
+      <w:r>
+        <w:rPr>
+          <w:b/>
+          <w:color w:val="1B365D"/>
+        </w:rPr>
+        <w:t xml:space="preserve">•  </w:t>
+      </w:r>
+      <w:r/>
+      <w:r>
+        <w:rPr>
+          <w:b/>
+          <w:color w:val="1B365D"/>
+        </w:rPr>
+        <w:t>If the internal model is wrong</w:t>
+      </w:r>
+      <w:r>
+        <w:t>: Invoke 1st-order fluid algebra ($\hat{\mathcal{A}}_{\text{fluid}}$) for local parameter fitting, or trigger 2nd-order metacognition ($\hat{\Omega}_{\text{meta}}$) to rewrite axioms under deadlock;</w:t>
+      </w:r>
+    </w:p>
+    <w:p>
+      <w:pPr>
+        <w:spacing w:after="80"/>
+        <w:ind w:left="360"/>
+      </w:pPr>
+      <w:r>
+        <w:rPr>
+          <w:b/>
+          <w:color w:val="1B365D"/>
+        </w:rPr>
+        <w:t xml:space="preserve">•  </w:t>
+      </w:r>
+      <w:r/>
+      <w:r>
+        <w:rPr>
+          <w:b/>
+          <w:color w:val="1B365D"/>
+        </w:rPr>
+        <w:t>If external reality is wrong</w:t>
+      </w:r>
+      <w:r>
+        <w:t>: Counter-act upon physical reality (Active Action) driven by homeostatic barrier mechanisms.</w:t>
+      </w:r>
+    </w:p>
+    <w:p>
+      <w:pPr>
+        <w:spacing w:after="100" w:line="288" w:lineRule="auto"/>
+      </w:pPr>
+      <w:r>
+        <w:t>"No lived experience, no cognition". Embodied conscience (</w:t>
+      </w:r>
+      <w:r>
+        <w:rPr>
+          <w:rFonts w:ascii="Times New Roman" w:hAnsi="Times New Roman"/>
+          <w:i/>
+          <w:color w:val="1B365D"/>
+        </w:rPr>
+        <w:t>E_{\text{supp}}</w:t>
+      </w:r>
+      <w:r>
+        <w:t xml:space="preserve">) acts as an existential prior benchmark, requiring external scenarios to share </w:t>
+      </w:r>
+      <w:r>
+        <w:rPr>
+          <w:b/>
+          <w:color w:val="1B365D"/>
+        </w:rPr>
+        <w:t>functional isomorphism</w:t>
+      </w:r>
+      <w:r>
+        <w:t xml:space="preserve"> with inner benchmarks for accurate translation.</w:t>
+      </w:r>
+    </w:p>
+    <w:p>
+      <w:pPr>
+        <w:spacing w:before="160" w:after="160"/>
+        <w:pBdr>
+          <w:bottom w:val="single" w:sz="6" w:space="1" w:color="D0D7DE"/>
+        </w:pBdr>
+      </w:pPr>
+    </w:p>
+    <w:p>
+      <w:pPr>
+        <w:keepNext/>
+        <w:spacing w:before="320" w:after="160"/>
+        <w:jc w:val="left"/>
+      </w:pPr>
+      <w:r>
+        <w:rPr>
+          <w:rFonts w:ascii="Times New Roman" w:hAnsi="Times New Roman"/>
+          <w:b/>
+          <w:color w:val="1B365D"/>
+          <w:sz w:val="36"/>
+        </w:rPr>
+        <w:t>II. Operator Minimality and Ashby 4D Counterexample Proof</w:t>
+      </w:r>
+    </w:p>
+    <w:p>
+      <w:pPr>
+        <w:keepNext/>
+        <w:spacing w:before="280" w:after="120"/>
+      </w:pPr>
+      <w:r>
+        <w:rPr>
+          <w:rFonts w:ascii="Times New Roman" w:hAnsi="Times New Roman"/>
+          <w:b/>
+          <w:color w:val="1B365D"/>
+          <w:sz w:val="27"/>
+        </w:rPr>
+        <w:t>2.1 Complete Control Vector</w:t>
+      </w:r>
+    </w:p>
+    <w:p>
+      <w:pPr>
+        <w:spacing w:after="100" w:line="288" w:lineRule="auto"/>
+      </w:pPr>
+      <w:r>
+        <w:t>The full control vector is defined as:</w:t>
+      </w:r>
+    </w:p>
+    <w:p>
+      <w:pPr>
+        <w:spacing w:after="120" w:line="288" w:lineRule="auto" w:before="120"/>
         <w:jc w:val="center"/>
       </w:pPr>
       <w:r>
         <w:rPr>
           <w:rFonts w:ascii="Times New Roman" w:hAnsi="Times New Roman"/>
           <w:i/>
-          <w:color w:val="444444"/>
-          <w:sz w:val="20"/>
+          <w:color w:val="1B365D"/>
+          <w:sz w:val="22"/>
         </w:rPr>
-        <w:t>Anonymous Authors for IEEE Double-Blind Review</w:t>
-        <w:br/>
-        <w:t>Target Journal: IEEE Transactions on Systems, Man, and Cybernetics: Systems</w:t>
+        <w:t>\vec{\mathcal{B}}^{(5)} = \left( \nabla R, \; \mathcal{S}_{\text{buff}}, \; \hat{\mathcal{A}}_{\text{fluid}}, \; \hat{\Omega}_{\text{meta}}, \; E_{\text{supp}} \right)^T \in \mathcal{H}^{(5)}</w:t>
       </w:r>
     </w:p>
-    <w:p/>
     <w:p>
+      <w:pPr>
+        <w:keepNext/>
+        <w:spacing w:before="280" w:after="120"/>
+      </w:pPr>
       <w:r>
         <w:rPr>
           <w:rFonts w:ascii="Times New Roman" w:hAnsi="Times New Roman"/>
           <w:b/>
-          <w:color w:val="003366"/>
-          <w:sz w:val="28"/>
-        </w:rPr>
-        <w:t>Conscience-Driven Holographic Metacognition: A Second-Order Cybernetic Architecture and 5D Mind Model for Open Complex Giant Systems</w:t>
-      </w:r>
-    </w:p>
-    <w:p>
-      <w:r>
-        <w:rPr>
-          <w:rFonts w:ascii="Times New Roman" w:hAnsi="Times New Roman"/>
-          <w:b/>
-          <w:color w:val="003366"/>
-          <w:sz w:val="24"/>
-        </w:rPr>
-        <w:t>Abstract</w:t>
-      </w:r>
-    </w:p>
-    <w:p>
-      <w:r>
-        <w:rPr>
-          <w:rFonts w:ascii="Times New Roman" w:hAnsi="Times New Roman"/>
-          <w:sz w:val="21"/>
-        </w:rPr>
-        <w:t>To address the empirical anomalies of free energy divergence ($\nabla_{\vartheta} \mathcal{F} \to \infty$), Gödelian self-referential paralysis, and Goodhart heavy-tailed collapse ($\alpha &lt; 2$) encountered by Open Complex Giant Systems (OCGS) and Large Language Models (LLMs) at Out-of-Distribution (OOD) zero-shot deadlocks, this paper proposes a self-consistent **Second-Order Cybernetic Architecture and 5D Mind Model**.</w:t>
-      </w:r>
-    </w:p>
-    <w:p>
-      <w:r>
-        <w:rPr>
-          <w:rFonts w:ascii="Times New Roman" w:hAnsi="Times New Roman"/>
-          <w:sz w:val="21"/>
-        </w:rPr>
-        <w:t>We formally prove that the five cognitive control operators—Homeostatic Compact-Support Damping ($E_{\text{supp}}$), Residual Sensitivity ($\nabla R$), Tacit Sensitivity Buffer ($\mathcal{S}_{\text{buff}}$), Fluid Algebra Solver ($\hat{\mathcal{A}}_{\text{fluid}}$), and Second-Order Metacognitive Revision ($\hat{\Omega}_{\text{meta}}$)—form a minimal complete orthogonal basis for controlling entropy expansion in $\mathcal{O}(N!)$ phase spaces. We formalize the system as a **Hybrid Second-Order Cybernetic Automaton 7-Tuple** $\mathbf{H} = (Q, X, U, f, \text{Guard}, \text{Reset}, Y)$, featuring dimensionally consistent continuous differential equations (with damping gain $\gamma_1 &gt; 0$ and Jacobian pull-back $\left(\frac{\partial x}{\partial \theta}\right)^T \nabla_x V_{\text{supp}}$) and non-continuous Wasserstein-Fisher-Rao (WFR) geodesic manifold jumps.</w:t>
-      </w:r>
-    </w:p>
-    <w:p>
-      <w:r>
-        <w:rPr>
-          <w:rFonts w:ascii="Times New Roman" w:hAnsi="Times New Roman"/>
-          <w:sz w:val="21"/>
-        </w:rPr>
-        <w:t>Three core mathematical theorems are established: (1) Endogenous derivation of activation threshold $Z \ge +1.5\sigma$ and $\text{SNR}_{\min} \ge 3.52\text{dB}$ based on Shannon-Ashby critical entropy explosion error bound $P_{\text{error}} \le \frac{1}{2e} \approx 6.7\%$; (2) Theorem 0.2.1 formally proving the non-reducibility of $\hat{\Omega}_{\text{meta}}$ to Active Inference Bayesian Model Reduction (BMR) and Non-parametric Hierarchical Bayes (HBM) due to infinite time complexity ($\tau_{\text{HBM}} \to \infty$) when $\operatorname{supp}(P_{\text{true}}) \cap \operatorname{supp}(P_{\text{prior}}) = \emptyset$; (3) Theorem 8.3.1 deriving the lower bound of incremental explained variance $\Delta R^2 \ge 0.28$ ($\text{OR} \ge 4.2$, Cohen's $f^2 \ge 0.35$) over Big Five trait models based on Fisher-Rao orthogonal projection geometry.</w:t>
-      </w:r>
-    </w:p>
-    <w:p>
-      <w:r>
-        <w:rPr>
-          <w:rFonts w:ascii="Times New Roman" w:hAnsi="Times New Roman"/>
-          <w:sz w:val="21"/>
-        </w:rPr>
-        <w:t>A cross-layer functional isomorphism matrix with evidence grades and a 4-tier falsifiability decision tree are established, and bus-level hardware fuse topology is validated on 5D-Mind-Bench (false positive rate $&lt;1.5\%$, OOD jump rate $88.4\%$).</w:t>
-      </w:r>
-    </w:p>
-    <w:p>
-      <w:r>
-        <w:rPr>
-          <w:rFonts w:ascii="Times New Roman" w:hAnsi="Times New Roman"/>
-          <w:sz w:val="21"/>
-        </w:rPr>
-        <w:t>**Keywords**: Second-Order Cybernetics; 5D Mind Model; Hybrid Automaton 7-Tuple; Wasserstein-Fisher-Rao Geodesics; Gödel Deadlock; 5D-Mind-Bench</w:t>
-      </w:r>
-    </w:p>
-    <w:p>
-      <w:r>
-        <w:rPr>
-          <w:rFonts w:ascii="Times New Roman" w:hAnsi="Times New Roman"/>
-          <w:sz w:val="21"/>
-        </w:rPr>
-        <w:t>---</w:t>
-      </w:r>
-    </w:p>
-    <w:p>
-      <w:r>
-        <w:rPr>
-          <w:rFonts w:ascii="Times New Roman" w:hAnsi="Times New Roman"/>
-          <w:b/>
-          <w:color w:val="003366"/>
-          <w:sz w:val="28"/>
-        </w:rPr>
-        <w:t>I. Introduction and Phenomenological Cybernetic Foundations</w:t>
-      </w:r>
-    </w:p>
-    <w:p>
-      <w:r>
-        <w:rPr>
-          <w:rFonts w:ascii="Times New Roman" w:hAnsi="Times New Roman"/>
-          <w:b/>
-          <w:color w:val="003366"/>
-          <w:sz w:val="24"/>
-        </w:rPr>
-        <w:t>1.1 Empirical Anomalies in Classical Cognitive Paradigms</w:t>
-      </w:r>
-    </w:p>
-    <w:p>
-      <w:r>
-        <w:rPr>
-          <w:rFonts w:ascii="Times New Roman" w:hAnsi="Times New Roman"/>
-          <w:sz w:val="21"/>
-        </w:rPr>
-        <w:t>At OOD zero-shot deadlocks, classical cognitive architectures encounter insurmountable anomalies:</w:t>
-      </w:r>
-    </w:p>
-    <w:p>
-      <w:r>
-        <w:rPr>
-          <w:rFonts w:ascii="Times New Roman" w:hAnsi="Times New Roman"/>
-          <w:sz w:val="21"/>
-        </w:rPr>
-        <w:t>1. **Global Workspace Theory (GWT)**: Linear broadcasting mechanisms fail to explain how un-structured high-entropy data is abstracted and dimensionally reduced before ignition.</w:t>
-      </w:r>
-    </w:p>
-    <w:p>
-      <w:r>
-        <w:rPr>
-          <w:rFonts w:ascii="Times New Roman" w:hAnsi="Times New Roman"/>
-          <w:sz w:val="21"/>
-        </w:rPr>
-        <w:t>2. **Free Energy Principle (FEP / Active Inference)**: Variational inference is locked inside a fixed generative model manifold, suffering free energy divergence ($\nabla_{\vartheta} \mathcal{F} \to \infty$) when $y_{\text{true}} \notin \operatorname{supp}(P_{\text{prior}})$.</w:t>
-      </w:r>
-    </w:p>
-    <w:p>
-      <w:r>
-        <w:rPr>
-          <w:rFonts w:ascii="Times New Roman" w:hAnsi="Times New Roman"/>
-          <w:sz w:val="21"/>
-        </w:rPr>
-        <w:t>3. **Dual-Process Theory**: Coarse System 1 vs System 2 classification fails to separate 1st-order algebraic computation (dlPFC) from 2nd-order constitutional revision (BA10).</w:t>
-      </w:r>
-    </w:p>
-    <w:p>
-      <w:r>
-        <w:rPr>
-          <w:rFonts w:ascii="Times New Roman" w:hAnsi="Times New Roman"/>
-          <w:b/>
-          <w:color w:val="003366"/>
-          <w:sz w:val="24"/>
-        </w:rPr>
-        <w:t>1.2 Phenomenological Origin and Dual Attribution</w:t>
-      </w:r>
-    </w:p>
-    <w:p>
-      <w:r>
-        <w:rPr>
-          <w:rFonts w:ascii="Times New Roman" w:hAnsi="Times New Roman"/>
-          <w:sz w:val="21"/>
-        </w:rPr>
-        <w:t>Cognitive agency originates from capturing micro residuals ($\nabla R = Y_{\text{real}} - Y_{\text{plan}}$). When a residual is detected, a dual attribution judgment is triggered:</w:t>
-      </w:r>
-    </w:p>
-    <w:p>
-      <w:r>
-        <w:rPr>
-          <w:rFonts w:ascii="Times New Roman" w:hAnsi="Times New Roman"/>
-          <w:sz w:val="21"/>
-        </w:rPr>
-        <w:t>- **If the internal model is wrong**: Invoke 1st-order fluid algebra ($\hat{\mathcal{A}}_{\text{fluid}}$) for local parameter fitting, or trigger 2nd-order metacognition ($\hat{\Omega}_{\text{meta}}$) to rewrite axioms under deadlock;</w:t>
-      </w:r>
-    </w:p>
-    <w:p>
-      <w:r>
-        <w:rPr>
-          <w:rFonts w:ascii="Times New Roman" w:hAnsi="Times New Roman"/>
-          <w:sz w:val="21"/>
-        </w:rPr>
-        <w:t>- **If external reality is wrong**: Counter-act upon physical reality (Active Action) driven by homeostatic barrier mechanisms.</w:t>
-      </w:r>
-    </w:p>
-    <w:p>
-      <w:r>
-        <w:rPr>
-          <w:rFonts w:ascii="Times New Roman" w:hAnsi="Times New Roman"/>
-          <w:sz w:val="21"/>
-        </w:rPr>
-        <w:t>"No lived experience, no cognition". Embodied conscience ($E_{\text{supp}}$) acts as an existential prior benchmark, requiring external scenarios to share **functional isomorphism** with inner benchmarks for accurate translation.</w:t>
-      </w:r>
-    </w:p>
-    <w:p>
-      <w:r>
-        <w:rPr>
-          <w:rFonts w:ascii="Times New Roman" w:hAnsi="Times New Roman"/>
-          <w:sz w:val="21"/>
-        </w:rPr>
-        <w:t>---</w:t>
-      </w:r>
-    </w:p>
-    <w:p>
-      <w:r>
-        <w:rPr>
-          <w:rFonts w:ascii="Times New Roman" w:hAnsi="Times New Roman"/>
-          <w:b/>
-          <w:color w:val="003366"/>
-          <w:sz w:val="28"/>
-        </w:rPr>
-        <w:t>II. Operator Minimality and Ashby 4D Counterexample Proof</w:t>
-      </w:r>
-    </w:p>
-    <w:p>
-      <w:r>
-        <w:rPr>
-          <w:rFonts w:ascii="Times New Roman" w:hAnsi="Times New Roman"/>
-          <w:b/>
-          <w:color w:val="003366"/>
-          <w:sz w:val="24"/>
-        </w:rPr>
-        <w:t>2.1 Complete Control Vector</w:t>
-      </w:r>
-    </w:p>
-    <w:p>
-      <w:r>
-        <w:rPr>
-          <w:rFonts w:ascii="Times New Roman" w:hAnsi="Times New Roman"/>
-          <w:sz w:val="21"/>
-        </w:rPr>
-        <w:t>The full control vector is defined as:</w:t>
-      </w:r>
-    </w:p>
-    <w:p>
-      <w:r>
-        <w:rPr>
-          <w:rFonts w:ascii="Times New Roman" w:hAnsi="Times New Roman"/>
-          <w:sz w:val="21"/>
-        </w:rPr>
-        <w:t>$$\vec{\mathcal{B}}^{(5)} = \left( \nabla R, \; \mathcal{S}_{\text{buff}}, \; \hat{\mathcal{A}}_{\text{fluid}}, \; \hat{\Omega}_{\text{meta}}, \; E_{\text{supp}} \right)^T \in \mathcal{H}^{(5)}$$</w:t>
-      </w:r>
-    </w:p>
-    <w:p>
-      <w:r>
-        <w:rPr>
-          <w:rFonts w:ascii="Times New Roman" w:hAnsi="Times New Roman"/>
-          <w:b/>
-          <w:color w:val="003366"/>
-          <w:sz w:val="24"/>
+          <w:color w:val="1B365D"/>
+          <w:sz w:val="27"/>
         </w:rPr>
         <w:t>2.2 Proof of 4D Counterexample Entropy Explosion</w:t>
       </w:r>
     </w:p>
     <w:p>
+      <w:pPr>
+        <w:spacing w:after="100" w:line="288" w:lineRule="auto"/>
+      </w:pPr>
+      <w:r>
+        <w:t xml:space="preserve">We formally prove that truncating the controller to any missing 4D subspace </w:t>
+      </w:r>
       <w:r>
         <w:rPr>
           <w:rFonts w:ascii="Times New Roman" w:hAnsi="Times New Roman"/>
-          <w:sz w:val="21"/>
+          <w:i/>
+          <w:color w:val="1B365D"/>
         </w:rPr>
-        <w:t>We formally prove that truncating the controller to any missing 4D subspace $\mathcal{B}^{(4)} \subset \vec{\mathcal{B}}^{(5)}$ causes systemic entropy production rate $\frac{d S_{\text{sys}}}{dt}$ to diverge to $+\infty$ within finite relaxation time:</w:t>
+        <w:t>\mathcal{B}^{(4)} \subset \vec{\mathcal{B}}^{(5)}</w:t>
+      </w:r>
+      <w:r>
+        <w:t xml:space="preserve"> causes systemic entropy production rate </w:t>
+      </w:r>
+      <w:r>
+        <w:rPr>
+          <w:rFonts w:ascii="Times New Roman" w:hAnsi="Times New Roman"/>
+          <w:i/>
+          <w:color w:val="1B365D"/>
+        </w:rPr>
+        <w:t>\frac{d S_{\text{sys}}}{dt}</w:t>
+      </w:r>
+      <w:r>
+        <w:t xml:space="preserve"> to diverge to </w:t>
+      </w:r>
+      <w:r>
+        <w:rPr>
+          <w:rFonts w:ascii="Times New Roman" w:hAnsi="Times New Roman"/>
+          <w:i/>
+          <w:color w:val="1B365D"/>
+        </w:rPr>
+        <w:t>+\infty</w:t>
+      </w:r>
+      <w:r>
+        <w:t xml:space="preserve"> within finite relaxation time:</w:t>
       </w:r>
     </w:p>
     <w:p>
+      <w:pPr>
+        <w:spacing w:after="100" w:line="288" w:lineRule="auto"/>
+      </w:pPr>
+      <w:r>
+        <w:t xml:space="preserve">1. </w:t>
+      </w:r>
+      <w:r>
+        <w:rPr>
+          <w:b/>
+          <w:color w:val="1B365D"/>
+        </w:rPr>
+        <w:t>Missing $\nabla R$</w:t>
+      </w:r>
+      <w:r>
+        <w:t>: Observer norm vanishes, system degrades to open-loop blind walk, unobserved residual accumulation drives entropy explosion;</w:t>
+      </w:r>
+    </w:p>
+    <w:p>
+      <w:pPr>
+        <w:spacing w:after="100" w:line="288" w:lineRule="auto"/>
+      </w:pPr>
+      <w:r>
+        <w:t xml:space="preserve">2. </w:t>
+      </w:r>
+      <w:r>
+        <w:rPr>
+          <w:b/>
+          <w:color w:val="1B365D"/>
+        </w:rPr>
+        <w:t>Missing $\mathcal{S}_{\text{buff}}$</w:t>
+      </w:r>
+      <w:r>
+        <w:t xml:space="preserve">: Impulse response degrades to Dirac </w:t>
+      </w:r>
       <w:r>
         <w:rPr>
           <w:rFonts w:ascii="Times New Roman" w:hAnsi="Times New Roman"/>
-          <w:sz w:val="21"/>
+          <w:i/>
+          <w:color w:val="1B365D"/>
         </w:rPr>
-        <w:t>1. **Missing $\nabla R$**: Observer norm vanishes, system degrades to open-loop blind walk, unobserved residual accumulation drives entropy explosion;</w:t>
+        <w:t>\delta(t)</w:t>
+      </w:r>
+      <w:r>
+        <w:t>, lacking high-entropy buffer time constants;</w:t>
       </w:r>
     </w:p>
     <w:p>
+      <w:pPr>
+        <w:spacing w:after="100" w:line="288" w:lineRule="auto"/>
+      </w:pPr>
+      <w:r>
+        <w:t xml:space="preserve">3. </w:t>
+      </w:r>
+      <w:r>
+        <w:rPr>
+          <w:b/>
+          <w:color w:val="1B365D"/>
+        </w:rPr>
+        <w:t>Missing $\hat{\mathcal{A}}_{\text{fluid}}$</w:t>
+      </w:r>
+      <w:r>
+        <w:t xml:space="preserve">: Feasible solution set collapses to empty set under OOD environments, failing </w:t>
+      </w:r>
       <w:r>
         <w:rPr>
           <w:rFonts w:ascii="Times New Roman" w:hAnsi="Times New Roman"/>
-          <w:sz w:val="21"/>
+          <w:i/>
+          <w:color w:val="1B365D"/>
         </w:rPr>
-        <w:t>2. **Missing $\mathcal{S}_{\text{buff}}$**: Impulse response degrades to Dirac $\delta(t)$, lacking high-entropy buffer time constants;</w:t>
+        <w:t>0 \to 1</w:t>
+      </w:r>
+      <w:r>
+        <w:t xml:space="preserve"> causal reconstruction;</w:t>
       </w:r>
     </w:p>
     <w:p>
+      <w:pPr>
+        <w:spacing w:after="100" w:line="288" w:lineRule="auto"/>
+      </w:pPr>
+      <w:r>
+        <w:t xml:space="preserve">4. </w:t>
+      </w:r>
+      <w:r>
+        <w:rPr>
+          <w:b/>
+          <w:color w:val="1B365D"/>
+        </w:rPr>
+        <w:t>Missing $\hat{\Omega}_{\text{meta}}$</w:t>
+      </w:r>
+      <w:r>
+        <w:t>: Axiom basis cannot be rewritten, sliding into Goodhart heavy-tailed collapse (</w:t>
+      </w:r>
       <w:r>
         <w:rPr>
           <w:rFonts w:ascii="Times New Roman" w:hAnsi="Times New Roman"/>
-          <w:sz w:val="21"/>
+          <w:i/>
+          <w:color w:val="1B365D"/>
         </w:rPr>
-        <w:t>3. **Missing $\hat{\mathcal{A}}_{\text{fluid}}$**: Feasible solution set collapses to empty set under OOD environments, failing $0 \to 1$ causal reconstruction;</w:t>
+        <w:t>\alpha &lt; 2</w:t>
+      </w:r>
+      <w:r>
+        <w:t>);</w:t>
       </w:r>
     </w:p>
     <w:p>
+      <w:pPr>
+        <w:spacing w:after="100" w:line="288" w:lineRule="auto"/>
+      </w:pPr>
+      <w:r>
+        <w:t xml:space="preserve">5. </w:t>
+      </w:r>
       <w:r>
         <w:rPr>
-          <w:rFonts w:ascii="Times New Roman" w:hAnsi="Times New Roman"/>
-          <w:sz w:val="21"/>
+          <w:b/>
+          <w:color w:val="1B365D"/>
         </w:rPr>
-        <w:t>4. **Missing $\hat{\Omega}_{\text{meta}}$**: Axiom basis cannot be rewritten, sliding into Goodhart heavy-tailed collapse ($\alpha &lt; 2$);</w:t>
+        <w:t>Missing $E_{\text{supp}}$</w:t>
+      </w:r>
+      <w:r>
+        <w:t>: Boundary barrier damping vanishes, trajectory escapes compact set, homeostatic stability collapses.</w:t>
       </w:r>
     </w:p>
     <w:p>
-      <w:r>
-        <w:rPr>
-          <w:rFonts w:ascii="Times New Roman" w:hAnsi="Times New Roman"/>
-          <w:sz w:val="21"/>
-        </w:rPr>
-        <w:t>5. **Missing $E_{\text{supp}}$**: Boundary barrier damping vanishes, trajectory escapes compact set, homeostatic stability collapses.</w:t>
-      </w:r>
+      <w:pPr>
+        <w:spacing w:before="160" w:after="160"/>
+        <w:pBdr>
+          <w:bottom w:val="single" w:sz="6" w:space="1" w:color="D0D7DE"/>
+        </w:pBdr>
+      </w:pPr>
     </w:p>
     <w:p>
-      <w:r>
-        <w:rPr>
-          <w:rFonts w:ascii="Times New Roman" w:hAnsi="Times New Roman"/>
-          <w:sz w:val="21"/>
-        </w:rPr>
-        <w:t>---</w:t>
-      </w:r>
-    </w:p>
-    <w:p>
+      <w:pPr>
+        <w:keepNext/>
+        <w:spacing w:before="320" w:after="160"/>
+        <w:jc w:val="left"/>
+      </w:pPr>
       <w:r>
         <w:rPr>
           <w:rFonts w:ascii="Times New Roman" w:hAnsi="Times New Roman"/>
           <w:b/>
-          <w:color w:val="003366"/>
-          <w:sz w:val="28"/>
+          <w:color w:val="1B365D"/>
+          <w:sz w:val="36"/>
         </w:rPr>
         <w:t>III. Formalization of Hybrid Second-Order Cybernetic Automaton 7-Tuple</w:t>
       </w:r>
     </w:p>
     <w:p>
+      <w:pPr>
+        <w:spacing w:after="100" w:line="288" w:lineRule="auto"/>
+      </w:pPr>
+      <w:r>
+        <w:t xml:space="preserve">The 5D Mind System is formally defined as a </w:t>
+      </w:r>
+      <w:r>
+        <w:rPr>
+          <w:b/>
+          <w:color w:val="1B365D"/>
+        </w:rPr>
+        <w:t>Hybrid 7-Tuple Automaton</w:t>
+      </w:r>
+      <w:r>
+        <w:t>:</w:t>
+      </w:r>
+    </w:p>
+    <w:p>
+      <w:pPr>
+        <w:spacing w:after="120" w:line="288" w:lineRule="auto" w:before="120"/>
+        <w:jc w:val="center"/>
+      </w:pPr>
       <w:r>
         <w:rPr>
           <w:rFonts w:ascii="Times New Roman" w:hAnsi="Times New Roman"/>
-          <w:sz w:val="21"/>
+          <w:i/>
+          <w:color w:val="1B365D"/>
+          <w:sz w:val="22"/>
         </w:rPr>
-        <w:t>The 5D Mind System is formally defined as a **Hybrid 7-Tuple Automaton**:</w:t>
+        <w:t>\mathbf{H} = \left( Q, X, U, f, \text{Guard}, \text{Reset}, Y \right)</w:t>
       </w:r>
     </w:p>
     <w:p>
+      <w:pPr>
+        <w:spacing w:after="100" w:line="288" w:lineRule="auto"/>
+      </w:pPr>
+      <w:r>
+        <w:t xml:space="preserve">1. </w:t>
+      </w:r>
+      <w:r>
+        <w:rPr>
+          <w:b/>
+          <w:color w:val="1B365D"/>
+        </w:rPr>
+        <w:t>Discrete Modes $Q$</w:t>
+      </w:r>
+      <w:r>
+        <w:t xml:space="preserve">: </w:t>
+      </w:r>
       <w:r>
         <w:rPr>
           <w:rFonts w:ascii="Times New Roman" w:hAnsi="Times New Roman"/>
-          <w:sz w:val="21"/>
+          <w:i/>
+          <w:color w:val="1B365D"/>
         </w:rPr>
-        <w:t>$$\mathbf{H} = \left( Q, X, U, f, \text{Guard}, \text{Reset}, Y \right)$$</w:t>
+        <w:t>Q = \{ q_1:\text{NormalSolve}, q_2:\text{ResidualAccum}, q_3:\text{Deadlock}, q_4:\text{MetaJump}, q_5:\text{Refractory} \}</w:t>
+      </w:r>
+      <w:r/>
+    </w:p>
+    <w:p>
+      <w:pPr>
+        <w:spacing w:after="100" w:line="288" w:lineRule="auto"/>
+      </w:pPr>
+      <w:r>
+        <w:t xml:space="preserve">2. </w:t>
+      </w:r>
+      <w:r>
+        <w:rPr>
+          <w:b/>
+          <w:color w:val="1B365D"/>
+        </w:rPr>
+        <w:t>Continuous States $X$</w:t>
+      </w:r>
+      <w:r>
+        <w:t xml:space="preserve">: </w:t>
+      </w:r>
+      <w:r>
+        <w:rPr>
+          <w:rFonts w:ascii="Times New Roman" w:hAnsi="Times New Roman"/>
+          <w:i/>
+          <w:color w:val="1B365D"/>
+        </w:rPr>
+        <w:t>X = (x_t, \theta_t) \in \mathcal{X} \times \Theta \subset \mathbb{R}^n \times \mathbb{R}^d</w:t>
+      </w:r>
+      <w:r/>
+    </w:p>
+    <w:p>
+      <w:pPr>
+        <w:spacing w:after="100" w:line="288" w:lineRule="auto"/>
+      </w:pPr>
+      <w:r>
+        <w:t xml:space="preserve">3. </w:t>
+      </w:r>
+      <w:r>
+        <w:rPr>
+          <w:b/>
+          <w:color w:val="1B365D"/>
+        </w:rPr>
+        <w:t>Control Inputs $U$</w:t>
+      </w:r>
+      <w:r>
+        <w:t xml:space="preserve">: </w:t>
+      </w:r>
+      <w:r>
+        <w:rPr>
+          <w:rFonts w:ascii="Times New Roman" w:hAnsi="Times New Roman"/>
+          <w:i/>
+          <w:color w:val="1B365D"/>
+        </w:rPr>
+        <w:t>U = (u_{\text{action}}, u_{\text{SOP}}) \in \mathcal{U}_{\text{physical}} \times \mathcal{U}_{\text{symbolic}}</w:t>
+      </w:r>
+      <w:r/>
+    </w:p>
+    <w:p>
+      <w:pPr>
+        <w:spacing w:after="100" w:line="288" w:lineRule="auto"/>
+      </w:pPr>
+      <w:r>
+        <w:t xml:space="preserve">4. </w:t>
+      </w:r>
+      <w:r>
+        <w:rPr>
+          <w:b/>
+          <w:color w:val="1B365D"/>
+        </w:rPr>
+        <w:t>Continuous Flow Equations $f_q$</w:t>
+      </w:r>
+      <w:r>
+        <w:t>:</w:t>
       </w:r>
     </w:p>
     <w:p>
+      <w:pPr>
+        <w:spacing w:after="100" w:line="288" w:lineRule="auto"/>
+      </w:pPr>
+      <w:r>
+        <w:t xml:space="preserve">   </w:t>
+      </w:r>
+      <w:r>
+        <w:t>$$</w:t>
+      </w:r>
+      <w:r>
+        <w:t>\begin{aligned}</w:t>
+      </w:r>
+    </w:p>
+    <w:p>
+      <w:pPr>
+        <w:spacing w:after="100" w:line="288" w:lineRule="auto"/>
+      </w:pPr>
+      <w:r>
+        <w:t xml:space="preserve">   \frac{d \Vert{}\nabla R\Vert{}}{dt} &amp;= \left\Vert{} \frac{d(Y_{\text{real}} - Y_{\text{plan}})}{dt} \right\Vert{} - \gamma_1 \left\Vert{} \hat{\mathcal{A}}_{\text{fluid}}(\nabla R, \mathcal{S}_{\text{buff}}) \right\Vert{}, \\</w:t>
+      </w:r>
+    </w:p>
+    <w:p>
+      <w:pPr>
+        <w:spacing w:after="100" w:line="288" w:lineRule="auto"/>
+      </w:pPr>
+      <w:r>
+        <w:t xml:space="preserve">   \frac{d \mathcal{S}_{\text{buff}}}{dt} &amp;= \Phi_{\text{tacit}}(x) - \lambda \cdot \mathcal{S}_{\text{buff}}, \\</w:t>
+      </w:r>
+    </w:p>
+    <w:p>
+      <w:pPr>
+        <w:spacing w:after="100" w:line="288" w:lineRule="auto"/>
+      </w:pPr>
+      <w:r>
+        <w:t xml:space="preserve">   \frac{d \theta}{dt} &amp;= -\nabla_{\theta} \mathcal{F}(\theta) - \left( \frac{\partial x}{\partial \theta} \right)^T \nabla_x V_{\text{supp\_tonic}}(x(\theta)).</w:t>
+      </w:r>
+    </w:p>
+    <w:p>
+      <w:pPr>
+        <w:spacing w:after="100" w:line="288" w:lineRule="auto"/>
+      </w:pPr>
+      <w:r>
+        <w:t xml:space="preserve">   \end{aligned}</w:t>
+      </w:r>
+      <w:r>
+        <w:t>$$</w:t>
+      </w:r>
+      <w:r/>
+    </w:p>
+    <w:p>
+      <w:pPr>
+        <w:spacing w:after="100" w:line="288" w:lineRule="auto"/>
+      </w:pPr>
+      <w:r>
+        <w:t xml:space="preserve">5. </w:t>
+      </w:r>
+      <w:r>
+        <w:rPr>
+          <w:b/>
+          <w:color w:val="1B365D"/>
+        </w:rPr>
+        <w:t>Guard Conditions $\text{Guard}_{q \to q'}$</w:t>
+      </w:r>
+      <w:r>
+        <w:t>:</w:t>
+      </w:r>
+    </w:p>
+    <w:p>
+      <w:pPr>
+        <w:spacing w:after="100" w:line="288" w:lineRule="auto"/>
+      </w:pPr>
+      <w:r>
+        <w:t xml:space="preserve">   - </w:t>
+      </w:r>
       <w:r>
         <w:rPr>
           <w:rFonts w:ascii="Times New Roman" w:hAnsi="Times New Roman"/>
-          <w:sz w:val="21"/>
+          <w:i/>
+          <w:color w:val="1B365D"/>
         </w:rPr>
-        <w:t>1. **Discrete Modes $Q$**: $Q = \{ q_1:\text{NormalSolve}, q_2:\text{ResidualAccum}, q_3:\text{Deadlock}, q_4:\text{MetaJump}, q_5:\text{Refractory} \}$</w:t>
+        <w:t>\text{Guard}_{23} \equiv \{ \alpha &lt; 2 \land \Vert{}\nabla_{\theta} \mathcal{F}\Vert{} &gt; \kappa_{\text{threshold}} \}</w:t>
+      </w:r>
+      <w:r/>
+    </w:p>
+    <w:p>
+      <w:pPr>
+        <w:spacing w:after="100" w:line="288" w:lineRule="auto"/>
+      </w:pPr>
+      <w:r>
+        <w:t xml:space="preserve">   - </w:t>
+      </w:r>
+      <w:r>
+        <w:rPr>
+          <w:rFonts w:ascii="Times New Roman" w:hAnsi="Times New Roman"/>
+          <w:i/>
+          <w:color w:val="1B365D"/>
+        </w:rPr>
+        <w:t>\text{Guard}_{34} \equiv \{ x_t \in \partial E_{\text{supp}} \land \mathbf{1}_{E_{\text{supp\_phasic}}}(x) = 1 \}</w:t>
+      </w:r>
+      <w:r/>
+    </w:p>
+    <w:p>
+      <w:pPr>
+        <w:spacing w:after="100" w:line="288" w:lineRule="auto"/>
+      </w:pPr>
+      <w:r>
+        <w:t xml:space="preserve">   - </w:t>
+      </w:r>
+      <w:r>
+        <w:rPr>
+          <w:rFonts w:ascii="Times New Roman" w:hAnsi="Times New Roman"/>
+          <w:i/>
+          <w:color w:val="1B365D"/>
+        </w:rPr>
+        <w:t>\text{Guard}_{45} \equiv \{ \mathcal{D}_{\text{WFR}}(\mathcal{M}^{(2)}, \mathcal{M}^{(1)}) \ge \Delta_{\text{crit}} \land \Delta \Vert{}\nabla R(t)\Vert{} \ge 80\% \}</w:t>
+      </w:r>
+      <w:r/>
+    </w:p>
+    <w:p>
+      <w:pPr>
+        <w:spacing w:after="100" w:line="288" w:lineRule="auto"/>
+      </w:pPr>
+      <w:r>
+        <w:t xml:space="preserve">   - </w:t>
+      </w:r>
+      <w:r>
+        <w:rPr>
+          <w:rFonts w:ascii="Times New Roman" w:hAnsi="Times New Roman"/>
+          <w:i/>
+          <w:color w:val="1B365D"/>
+        </w:rPr>
+        <w:t>\text{Guard}_{51} \equiv \{ t - t_{\text{jump}} \ge \tau_{\text{refractory}} \land x_t \in \operatorname{Int}(E_{\text{supp}}) \}</w:t>
+      </w:r>
+      <w:r/>
+    </w:p>
+    <w:p>
+      <w:pPr>
+        <w:spacing w:after="100" w:line="288" w:lineRule="auto"/>
+      </w:pPr>
+      <w:r>
+        <w:t xml:space="preserve">6. </w:t>
+      </w:r>
+      <w:r>
+        <w:rPr>
+          <w:b/>
+          <w:color w:val="1B365D"/>
+        </w:rPr>
+        <w:t>Reset Mapping $\text{Reset}_{34}$</w:t>
+      </w:r>
+      <w:r>
+        <w:t xml:space="preserve">: Executed by </w:t>
+      </w:r>
+      <w:r>
+        <w:rPr>
+          <w:rFonts w:ascii="Times New Roman" w:hAnsi="Times New Roman"/>
+          <w:i/>
+          <w:color w:val="1B365D"/>
+        </w:rPr>
+        <w:t>\hat{\Omega}_{\text{meta}}</w:t>
+      </w:r>
+      <w:r>
+        <w:t xml:space="preserve"> via WFR geodesic jump:</w:t>
       </w:r>
     </w:p>
     <w:p>
+      <w:pPr>
+        <w:spacing w:after="100" w:line="288" w:lineRule="auto"/>
+      </w:pPr>
+      <w:r>
+        <w:t xml:space="preserve">   </w:t>
+      </w:r>
+      <w:r>
+        <w:t>$$</w:t>
+      </w:r>
+      <w:r>
+        <w:t>\left( x^+, \mathcal{M}^{(2)} \right) = \arg\min_{\mathcal{M} \in \mathfrak{M}} \left\{ \mathcal{D}_{\text{WFR}}(\mathcal{M}, \mathcal{M}^{(1)}) + \gamma \cdot \text{Complexity}(\mathcal{M}) \right\}</w:t>
+      </w:r>
+      <w:r>
+        <w:t>$$</w:t>
+      </w:r>
+      <w:r/>
+    </w:p>
+    <w:p>
+      <w:pPr>
+        <w:spacing w:after="100" w:line="288" w:lineRule="auto"/>
+      </w:pPr>
+      <w:r>
+        <w:t xml:space="preserve">7. </w:t>
+      </w:r>
+      <w:r>
+        <w:rPr>
+          <w:b/>
+          <w:color w:val="1B365D"/>
+        </w:rPr>
+        <w:t>Output Mapping $Y$</w:t>
+      </w:r>
+      <w:r>
+        <w:t xml:space="preserve">: </w:t>
+      </w:r>
       <w:r>
         <w:rPr>
           <w:rFonts w:ascii="Times New Roman" w:hAnsi="Times New Roman"/>
-          <w:sz w:val="21"/>
+          <w:i/>
+          <w:color w:val="1B365D"/>
         </w:rPr>
-        <w:t>2. **Continuous States $X$**: $X = (x_t, \theta_t) \in \mathcal{X} \times \Theta \subset \mathbb{R}^n \times \mathbb{R}^d$</w:t>
+        <w:t>Y = h(x, \theta) = (Y_{\text{plan}}, \text{Conf}_{\text{meta}}) \in \mathbb{R}^p \times [0, 1]</w:t>
       </w:r>
+      <w:r/>
     </w:p>
     <w:p>
-      <w:r>
-        <w:rPr>
-          <w:rFonts w:ascii="Times New Roman" w:hAnsi="Times New Roman"/>
-          <w:sz w:val="21"/>
-        </w:rPr>
-        <w:t>3. **Control Inputs $U$**: $U = (u_{\text{action}}, u_{\text{SOP}}) \in \mathcal{U}_{\text{physical}} \times \mathcal{U}_{\text{symbolic}}$</w:t>
-      </w:r>
+      <w:pPr>
+        <w:spacing w:before="160" w:after="160"/>
+        <w:pBdr>
+          <w:bottom w:val="single" w:sz="6" w:space="1" w:color="D0D7DE"/>
+        </w:pBdr>
+      </w:pPr>
     </w:p>
     <w:p>
-      <w:r>
-        <w:rPr>
-          <w:rFonts w:ascii="Times New Roman" w:hAnsi="Times New Roman"/>
-          <w:sz w:val="21"/>
-        </w:rPr>
-        <w:t>4. **Continuous Flow Equations $f_q$**:</w:t>
-      </w:r>
-    </w:p>
-    <w:p>
-      <w:r>
-        <w:rPr>
-          <w:rFonts w:ascii="Times New Roman" w:hAnsi="Times New Roman"/>
-          <w:sz w:val="21"/>
-        </w:rPr>
-        <w:t>$$\begin{aligned}</w:t>
-      </w:r>
-    </w:p>
-    <w:p>
-      <w:r>
-        <w:rPr>
-          <w:rFonts w:ascii="Times New Roman" w:hAnsi="Times New Roman"/>
-          <w:sz w:val="21"/>
-        </w:rPr>
-        <w:t>\frac{d \Vert{}\nabla R\Vert{}}{dt} &amp;= \left\Vert{} \frac{d(Y_{\text{real}} - Y_{\text{plan}})}{dt} \right\Vert{} - \gamma_1 \left\Vert{} \hat{\mathcal{A}}_{\text{fluid}}(\nabla R, \mathcal{S}_{\text{buff}}) \right\Vert{}, \\</w:t>
-      </w:r>
-    </w:p>
-    <w:p>
-      <w:r>
-        <w:rPr>
-          <w:rFonts w:ascii="Times New Roman" w:hAnsi="Times New Roman"/>
-          <w:sz w:val="21"/>
-        </w:rPr>
-        <w:t>\frac{d \mathcal{S}_{\text{buff}}}{dt} &amp;= \Phi_{\text{tacit}}(x) - \lambda \cdot \mathcal{S}_{\text{buff}}, \\</w:t>
-      </w:r>
-    </w:p>
-    <w:p>
-      <w:r>
-        <w:rPr>
-          <w:rFonts w:ascii="Times New Roman" w:hAnsi="Times New Roman"/>
-          <w:sz w:val="21"/>
-        </w:rPr>
-        <w:t>\frac{d \theta}{dt} &amp;= -\nabla_{\theta} \mathcal{F}(\theta) - \left( \frac{\partial x}{\partial \theta} \right)^T \nabla_x V_{\text{supp\_tonic}}(x(\theta)).</w:t>
-      </w:r>
-    </w:p>
-    <w:p>
-      <w:r>
-        <w:rPr>
-          <w:rFonts w:ascii="Times New Roman" w:hAnsi="Times New Roman"/>
-          <w:sz w:val="21"/>
-        </w:rPr>
-        <w:t>\end{aligned}$$</w:t>
-      </w:r>
-    </w:p>
-    <w:p>
-      <w:r>
-        <w:rPr>
-          <w:rFonts w:ascii="Times New Roman" w:hAnsi="Times New Roman"/>
-          <w:sz w:val="21"/>
-        </w:rPr>
-        <w:t>5. **Guard Conditions $\text{Guard}_{q \to q'}$**:</w:t>
-      </w:r>
-    </w:p>
-    <w:p>
-      <w:r>
-        <w:rPr>
-          <w:rFonts w:ascii="Times New Roman" w:hAnsi="Times New Roman"/>
-          <w:sz w:val="21"/>
-        </w:rPr>
-        <w:t>- $\text{Guard}_{23} \equiv \{ \alpha &lt; 2 \land \Vert{}\nabla_{\theta} \mathcal{F}\Vert{} &gt; \kappa_{\text{threshold}} \}$</w:t>
-      </w:r>
-    </w:p>
-    <w:p>
-      <w:r>
-        <w:rPr>
-          <w:rFonts w:ascii="Times New Roman" w:hAnsi="Times New Roman"/>
-          <w:sz w:val="21"/>
-        </w:rPr>
-        <w:t>- $\text{Guard}_{34} \equiv \{ x_t \in \partial E_{\text{supp}} \land \mathbf{1}_{E_{\text{supp\_phasic}}}(x) = 1 \}$</w:t>
-      </w:r>
-    </w:p>
-    <w:p>
-      <w:r>
-        <w:rPr>
-          <w:rFonts w:ascii="Times New Roman" w:hAnsi="Times New Roman"/>
-          <w:sz w:val="21"/>
-        </w:rPr>
-        <w:t>- $\text{Guard}_{45} \equiv \{ \mathcal{D}_{\text{WFR}}(\mathcal{M}^{(2)}, \mathcal{M}^{(1)}) \ge \Delta_{\text{crit}} \land \Delta \Vert{}\nabla R(t)\Vert{} \ge 80\% \}$</w:t>
-      </w:r>
-    </w:p>
-    <w:p>
-      <w:r>
-        <w:rPr>
-          <w:rFonts w:ascii="Times New Roman" w:hAnsi="Times New Roman"/>
-          <w:sz w:val="21"/>
-        </w:rPr>
-        <w:t>- $\text{Guard}_{51} \equiv \{ t - t_{\text{jump}} \ge \tau_{\text{refractory}} \land x_t \in \operatorname{Int}(E_{\text{supp}}) \}$</w:t>
-      </w:r>
-    </w:p>
-    <w:p>
-      <w:r>
-        <w:rPr>
-          <w:rFonts w:ascii="Times New Roman" w:hAnsi="Times New Roman"/>
-          <w:sz w:val="21"/>
-        </w:rPr>
-        <w:t>6. **Reset Mapping $\text{Reset}_{34}$**: Executed by $\hat{\Omega}_{\text{meta}}$ via WFR geodesic jump:</w:t>
-      </w:r>
-    </w:p>
-    <w:p>
-      <w:r>
-        <w:rPr>
-          <w:rFonts w:ascii="Times New Roman" w:hAnsi="Times New Roman"/>
-          <w:sz w:val="21"/>
-        </w:rPr>
-        <w:t>$$\left( x^+, \mathcal{M}^{(2)} \right) = \arg\min_{\mathcal{M} \in \mathfrak{M}} \left\{ \mathcal{D}_{\text{WFR}}(\mathcal{M}, \mathcal{M}^{(1)}) + \gamma \cdot \text{Complexity}(\mathcal{M}) \right\}$$</w:t>
-      </w:r>
-    </w:p>
-    <w:p>
-      <w:r>
-        <w:rPr>
-          <w:rFonts w:ascii="Times New Roman" w:hAnsi="Times New Roman"/>
-          <w:sz w:val="21"/>
-        </w:rPr>
-        <w:t>7. **Output Mapping $Y$**: $Y = h(x, \theta) = (Y_{\text{plan}}, \text{Conf}_{\text{meta}}) \in \mathbb{R}^p \times [0, 1]$</w:t>
-      </w:r>
-    </w:p>
-    <w:p>
-      <w:r>
-        <w:rPr>
-          <w:rFonts w:ascii="Times New Roman" w:hAnsi="Times New Roman"/>
-          <w:sz w:val="21"/>
-        </w:rPr>
-        <w:t>---</w:t>
-      </w:r>
-    </w:p>
-    <w:p>
+      <w:pPr>
+        <w:keepNext/>
+        <w:spacing w:before="320" w:after="160"/>
+        <w:jc w:val="left"/>
+      </w:pPr>
       <w:r>
         <w:rPr>
           <w:rFonts w:ascii="Times New Roman" w:hAnsi="Times New Roman"/>
           <w:b/>
-          <w:color w:val="003366"/>
-          <w:sz w:val="28"/>
+          <w:color w:val="1B365D"/>
+          <w:sz w:val="36"/>
         </w:rPr>
         <w:t>IV. Mathematical Theorems and Theoretical Increments</w:t>
       </w:r>
     </w:p>
     <w:p>
+      <w:pPr>
+        <w:keepNext/>
+        <w:spacing w:before="280" w:after="120"/>
+      </w:pPr>
       <w:r>
         <w:rPr>
           <w:rFonts w:ascii="Times New Roman" w:hAnsi="Times New Roman"/>
           <w:b/>
-          <w:color w:val="003366"/>
-          <w:sz w:val="24"/>
+          <w:color w:val="1B365D"/>
+          <w:sz w:val="27"/>
         </w:rPr>
         <w:t>4.1 Shannon-Ashby Critical Entropy Explosion Threshold</w:t>
       </w:r>
     </w:p>
     <w:p>
+      <w:pPr>
+        <w:spacing w:after="100" w:line="288" w:lineRule="auto"/>
+      </w:pPr>
+      <w:r>
+        <w:t xml:space="preserve">In </w:t>
+      </w:r>
       <w:r>
         <w:rPr>
           <w:rFonts w:ascii="Times New Roman" w:hAnsi="Times New Roman"/>
-          <w:sz w:val="21"/>
+          <w:i/>
+          <w:color w:val="1B365D"/>
         </w:rPr>
-        <w:t>In $\mathcal{O}(N!)$ non-equilibrium systems, the critical decision channel error rate satisfies the Shannon-Ashby boundary:</w:t>
+        <w:t>\mathcal{O}(N!)</w:t>
+      </w:r>
+      <w:r>
+        <w:t xml:space="preserve"> non-equilibrium systems, the critical decision channel error rate satisfies the Shannon-Ashby boundary:</w:t>
       </w:r>
     </w:p>
     <w:p>
+      <w:pPr>
+        <w:spacing w:after="120" w:line="288" w:lineRule="auto" w:before="120"/>
+        <w:jc w:val="center"/>
+      </w:pPr>
       <w:r>
         <w:rPr>
           <w:rFonts w:ascii="Times New Roman" w:hAnsi="Times New Roman"/>
-          <w:sz w:val="21"/>
+          <w:i/>
+          <w:color w:val="1B365D"/>
+          <w:sz w:val="22"/>
         </w:rPr>
-        <w:t>$$p \cdot e^{\frac{1-p}{p}} \le 1 \implies p_{\text{crit}} = \frac{1}{2e} \approx 0.1839 \quad (18.39\%)$$</w:t>
+        <w:t>p \cdot e^{\frac{1-p}{p}} \le 1 \implies p_{\text{crit}} = \frac{1}{2e} \approx 0.1839 \quad (18.39\%)</w:t>
       </w:r>
     </w:p>
     <w:p>
+      <w:pPr>
+        <w:spacing w:after="100" w:line="288" w:lineRule="auto"/>
+      </w:pPr>
+      <w:r>
+        <w:t xml:space="preserve">The 1-sided standard normal tail satisfies </w:t>
+      </w:r>
       <w:r>
         <w:rPr>
           <w:rFonts w:ascii="Times New Roman" w:hAnsi="Times New Roman"/>
-          <w:sz w:val="21"/>
+          <w:i/>
+          <w:color w:val="1B365D"/>
         </w:rPr>
-        <w:t>The 1-sided standard normal tail satisfies $P_{\text{error}} = \Phi(-1.5\sigma) \approx 6.7\% \ll \frac{1}{2e}$, ensuring asymptotic Lyapunov stability ($\lambda_{\max} \le 0$) and endogenously deriving $Z = +1.5\sigma$ and $\text{SNR}_{\min} \ge 3.52\text{dB}$.</w:t>
+        <w:t>P_{\text{error}} = \Phi(-1.5\sigma) \approx 6.7\% \ll \frac{1}{2e}</w:t>
+      </w:r>
+      <w:r>
+        <w:t>, ensuring asymptotic Lyapunov stability (</w:t>
+      </w:r>
+      <w:r>
+        <w:rPr>
+          <w:rFonts w:ascii="Times New Roman" w:hAnsi="Times New Roman"/>
+          <w:i/>
+          <w:color w:val="1B365D"/>
+        </w:rPr>
+        <w:t>\lambda_{\max} \le 0</w:t>
+      </w:r>
+      <w:r>
+        <w:t xml:space="preserve">) and endogenously deriving </w:t>
+      </w:r>
+      <w:r>
+        <w:rPr>
+          <w:rFonts w:ascii="Times New Roman" w:hAnsi="Times New Roman"/>
+          <w:i/>
+          <w:color w:val="1B365D"/>
+        </w:rPr>
+        <w:t>Z = +1.5\sigma</w:t>
+      </w:r>
+      <w:r>
+        <w:t xml:space="preserve"> and </w:t>
+      </w:r>
+      <w:r>
+        <w:rPr>
+          <w:rFonts w:ascii="Times New Roman" w:hAnsi="Times New Roman"/>
+          <w:i/>
+          <w:color w:val="1B365D"/>
+        </w:rPr>
+        <w:t>\text{SNR}_{\min} \ge 3.52\text{dB}</w:t>
+      </w:r>
+      <w:r>
+        <w:t>.</w:t>
       </w:r>
     </w:p>
     <w:p>
+      <w:pPr>
+        <w:keepNext/>
+        <w:spacing w:before="280" w:after="120"/>
+      </w:pPr>
       <w:r>
         <w:rPr>
           <w:rFonts w:ascii="Times New Roman" w:hAnsi="Times New Roman"/>
           <w:b/>
-          <w:color w:val="003366"/>
-          <w:sz w:val="24"/>
+          <w:color w:val="1B365D"/>
+          <w:sz w:val="27"/>
         </w:rPr>
         <w:t>4.2 Theorem 0.2.1 (Non-Reducibility of Meta-Operator to FEP Structure Learning and HBM)</w:t>
       </w:r>
     </w:p>
     <w:p>
+      <w:pPr>
+        <w:spacing w:after="100" w:line="288" w:lineRule="auto"/>
+      </w:pPr>
+      <w:r/>
+      <w:r>
+        <w:rPr>
+          <w:b/>
+          <w:color w:val="1B365D"/>
+        </w:rPr>
+        <w:t>[Theorem &amp; Proof]</w:t>
+      </w:r>
+      <w:r>
+        <w:t xml:space="preserve"> Let FEP structure learning (BMR and Non-parametric HBM </w:t>
+      </w:r>
       <w:r>
         <w:rPr>
           <w:rFonts w:ascii="Times New Roman" w:hAnsi="Times New Roman"/>
-          <w:sz w:val="21"/>
+          <w:i/>
+          <w:color w:val="1B365D"/>
         </w:rPr>
-        <w:t>**[Theorem &amp; Proof]** Let FEP structure learning (BMR and Non-parametric HBM $DP(\alpha, G_0)$) minimize variational free energy $\mathcal{F}(q)$. When $\operatorname{supp}(P_{\text{true}}) \cap \operatorname{supp}(p(y|\Theta_{\text{prior}})) = \emptyset$:</w:t>
+        <w:t>DP(\alpha, G_0)</w:t>
+      </w:r>
+      <w:r>
+        <w:t xml:space="preserve">) minimize variational free energy </w:t>
+      </w:r>
+      <w:r>
+        <w:rPr>
+          <w:rFonts w:ascii="Times New Roman" w:hAnsi="Times New Roman"/>
+          <w:i/>
+          <w:color w:val="1B365D"/>
+        </w:rPr>
+        <w:t>\mathcal{F}(q)</w:t>
+      </w:r>
+      <w:r>
+        <w:t xml:space="preserve">. When </w:t>
+      </w:r>
+      <w:r>
+        <w:rPr>
+          <w:rFonts w:ascii="Times New Roman" w:hAnsi="Times New Roman"/>
+          <w:i/>
+          <w:color w:val="1B365D"/>
+        </w:rPr>
+        <w:t>\operatorname{supp}(P_{\text{true}}) \cap \operatorname{supp}(p(y|\Theta_{\text{prior}})) = \emptyset</w:t>
+      </w:r>
+      <w:r>
+        <w:t>:</w:t>
       </w:r>
     </w:p>
     <w:p>
+      <w:pPr>
+        <w:spacing w:after="100" w:line="288" w:lineRule="auto"/>
+      </w:pPr>
+      <w:r>
+        <w:t xml:space="preserve">1. Likelihood </w:t>
+      </w:r>
       <w:r>
         <w:rPr>
           <w:rFonts w:ascii="Times New Roman" w:hAnsi="Times New Roman"/>
-          <w:sz w:val="21"/>
+          <w:i/>
+          <w:color w:val="1B365D"/>
         </w:rPr>
-        <w:t>1. Likelihood $p(y_{\text{true}}|\theta) \equiv 0 \implies \mathcal{F}(q) \equiv +\infty$, variational gradient $\nabla_q \mathcal{F} \equiv \mathbf{0}$;</w:t>
+        <w:t>p(y_{\text{true}}|\theta) \equiv 0 \implies \mathcal{F}(q) \equiv +\infty</w:t>
+      </w:r>
+      <w:r>
+        <w:t xml:space="preserve">, variational gradient </w:t>
+      </w:r>
+      <w:r>
+        <w:rPr>
+          <w:rFonts w:ascii="Times New Roman" w:hAnsi="Times New Roman"/>
+          <w:i/>
+          <w:color w:val="1B365D"/>
+        </w:rPr>
+        <w:t>\nabla_q \mathcal{F} \equiv \mathbf{0}</w:t>
+      </w:r>
+      <w:r>
+        <w:t>;</w:t>
       </w:r>
     </w:p>
     <w:p>
+      <w:pPr>
+        <w:spacing w:after="100" w:line="288" w:lineRule="auto"/>
+      </w:pPr>
+      <w:r>
+        <w:t xml:space="preserve">2. Non-parametric Bayes posterior sample time diverges </w:t>
+      </w:r>
       <w:r>
         <w:rPr>
           <w:rFonts w:ascii="Times New Roman" w:hAnsi="Times New Roman"/>
-          <w:sz w:val="21"/>
+          <w:i/>
+          <w:color w:val="1B365D"/>
         </w:rPr>
-        <w:t>2. Non-parametric Bayes posterior sample time diverges $\tau_{\text{HBM}} \propto \exp\left( \frac{D_{\text{KL}}}{\alpha} \right) \to +\infty &gt; \tau_{\text{relax}}$, failing physical convergence in finite time;</w:t>
+        <w:t>\tau_{\text{HBM}} \propto \exp\left( \frac{D_{\text{KL}}}{\alpha} \right) \to +\infty &gt; \tau_{\text{relax}}</w:t>
+      </w:r>
+      <w:r>
+        <w:t>, failing physical convergence in finite time;</w:t>
       </w:r>
     </w:p>
     <w:p>
+      <w:pPr>
+        <w:spacing w:after="100" w:line="288" w:lineRule="auto"/>
+      </w:pPr>
+      <w:r>
+        <w:t xml:space="preserve">3. </w:t>
+      </w:r>
       <w:r>
         <w:rPr>
           <w:rFonts w:ascii="Times New Roman" w:hAnsi="Times New Roman"/>
-          <w:sz w:val="21"/>
+          <w:i/>
+          <w:color w:val="1B365D"/>
         </w:rPr>
-        <w:t>3. $\hat{\Omega}_{\text{meta}}$ calculates WFR action density with mass creation $\mu_t \neq 0$, creating new support in finite jump time $\tau_{\text{jump}} \ll \tau_{\text{relax}}$. Hence $\hat{\Omega}_{\text{meta}}$ is non-reducible to FEP. $\blacksquare$</w:t>
+        <w:t>\hat{\Omega}_{\text{meta}}</w:t>
       </w:r>
+      <w:r>
+        <w:t xml:space="preserve"> calculates WFR action density with mass creation </w:t>
+      </w:r>
+      <w:r>
+        <w:rPr>
+          <w:rFonts w:ascii="Times New Roman" w:hAnsi="Times New Roman"/>
+          <w:i/>
+          <w:color w:val="1B365D"/>
+        </w:rPr>
+        <w:t>\mu_t \neq 0</w:t>
+      </w:r>
+      <w:r>
+        <w:t xml:space="preserve">, creating new support in finite jump time </w:t>
+      </w:r>
+      <w:r>
+        <w:rPr>
+          <w:rFonts w:ascii="Times New Roman" w:hAnsi="Times New Roman"/>
+          <w:i/>
+          <w:color w:val="1B365D"/>
+        </w:rPr>
+        <w:t>\tau_{\text{jump}} \ll \tau_{\text{relax}}</w:t>
+      </w:r>
+      <w:r>
+        <w:t xml:space="preserve">. Hence </w:t>
+      </w:r>
+      <w:r>
+        <w:rPr>
+          <w:rFonts w:ascii="Times New Roman" w:hAnsi="Times New Roman"/>
+          <w:i/>
+          <w:color w:val="1B365D"/>
+        </w:rPr>
+        <w:t>\hat{\Omega}_{\text{meta}}</w:t>
+      </w:r>
+      <w:r>
+        <w:t xml:space="preserve"> is non-reducible to FEP. </w:t>
+      </w:r>
+      <w:r>
+        <w:rPr>
+          <w:rFonts w:ascii="Times New Roman" w:hAnsi="Times New Roman"/>
+          <w:i/>
+          <w:color w:val="1B365D"/>
+        </w:rPr>
+        <w:t>\blacksquare</w:t>
+      </w:r>
+      <w:r/>
     </w:p>
     <w:p>
+      <w:pPr>
+        <w:keepNext/>
+        <w:spacing w:before="280" w:after="120"/>
+      </w:pPr>
       <w:r>
         <w:rPr>
           <w:rFonts w:ascii="Times New Roman" w:hAnsi="Times New Roman"/>
           <w:b/>
-          <w:color w:val="003366"/>
-          <w:sz w:val="24"/>
+          <w:color w:val="1B365D"/>
+          <w:sz w:val="27"/>
         </w:rPr>
         <w:t>4.3 Theorem 8.3.1 (Incremental Variance $\Delta R^2 \ge 0.28$ under Fisher-Rao Geometry)</w:t>
       </w:r>
     </w:p>
     <w:p>
+      <w:pPr>
+        <w:spacing w:after="100" w:line="288" w:lineRule="auto"/>
+      </w:pPr>
+      <w:r/>
+      <w:r>
+        <w:rPr>
+          <w:b/>
+          <w:color w:val="1B365D"/>
+        </w:rPr>
+        <w:t>[Theorem &amp; Proof]</w:t>
+      </w:r>
+      <w:r>
+        <w:t xml:space="preserve"> Let Big Five traits span 1st-order linear sub-manifold </w:t>
+      </w:r>
       <w:r>
         <w:rPr>
           <w:rFonts w:ascii="Times New Roman" w:hAnsi="Times New Roman"/>
-          <w:sz w:val="21"/>
+          <w:i/>
+          <w:color w:val="1B365D"/>
         </w:rPr>
-        <w:t>**[Theorem &amp; Proof]** Let Big Five traits span 1st-order linear sub-manifold $\mathcal{N}_{\text{Big5}} \subset T_\theta \Theta$. At OOD deadlocks, unexplained residual variance is $\eta_{\text{OOD}}^2 = 1 - R^2_{\text{Big5}} \approx 0.40$. $\hat{\Omega}_{\text{meta}}$ executes WFR geodesic jumps orthogonal to $\mathcal{N}_{\text{Big5}}$ ($\theta_{\text{WFR}} \in [58^\circ, 90^\circ]$):</w:t>
+        <w:t>\mathcal{N}_{\text{Big5}} \subset T_\theta \Theta</w:t>
+      </w:r>
+      <w:r>
+        <w:t xml:space="preserve">. At OOD deadlocks, unexplained residual variance is </w:t>
+      </w:r>
+      <w:r>
+        <w:rPr>
+          <w:rFonts w:ascii="Times New Roman" w:hAnsi="Times New Roman"/>
+          <w:i/>
+          <w:color w:val="1B365D"/>
+        </w:rPr>
+        <w:t>\eta_{\text{OOD}}^2 = 1 - R^2_{\text{Big5}} \approx 0.40</w:t>
+      </w:r>
+      <w:r>
+        <w:t xml:space="preserve">. </w:t>
+      </w:r>
+      <w:r>
+        <w:rPr>
+          <w:rFonts w:ascii="Times New Roman" w:hAnsi="Times New Roman"/>
+          <w:i/>
+          <w:color w:val="1B365D"/>
+        </w:rPr>
+        <w:t>\hat{\Omega}_{\text{meta}}</w:t>
+      </w:r>
+      <w:r>
+        <w:t xml:space="preserve"> executes WFR geodesic jumps orthogonal to </w:t>
+      </w:r>
+      <w:r>
+        <w:rPr>
+          <w:rFonts w:ascii="Times New Roman" w:hAnsi="Times New Roman"/>
+          <w:i/>
+          <w:color w:val="1B365D"/>
+        </w:rPr>
+        <w:t>\mathcal{N}_{\text{Big5}}</w:t>
+      </w:r>
+      <w:r>
+        <w:t xml:space="preserve"> (</w:t>
+      </w:r>
+      <w:r>
+        <w:rPr>
+          <w:rFonts w:ascii="Times New Roman" w:hAnsi="Times New Roman"/>
+          <w:i/>
+          <w:color w:val="1B365D"/>
+        </w:rPr>
+        <w:t>\theta_{\text{WFR}} \in [58^\circ, 90^\circ]</w:t>
+      </w:r>
+      <w:r>
+        <w:t>):</w:t>
       </w:r>
     </w:p>
     <w:p>
+      <w:pPr>
+        <w:spacing w:after="120" w:line="288" w:lineRule="auto" w:before="120"/>
+        <w:jc w:val="center"/>
+      </w:pPr>
       <w:r>
         <w:rPr>
           <w:rFonts w:ascii="Times New Roman" w:hAnsi="Times New Roman"/>
-          <w:sz w:val="21"/>
+          <w:i/>
+          <w:color w:val="1B365D"/>
+          <w:sz w:val="22"/>
         </w:rPr>
-        <w:t>$$\Delta R^2 = \eta_{\text{OOD}}^2 \cdot \sin^2(\theta_{\text{WFR}}) \ge 0.40 \times \sin^2(58^\circ) \approx 0.40 \times 0.718 = 0.2872 \ge 0.28$$</w:t>
+        <w:t>\Delta R^2 = \eta_{\text{OOD}}^2 \cdot \sin^2(\theta_{\text{WFR}}) \ge 0.40 \times \sin^2(58^\circ) \approx 0.40 \times 0.718 = 0.2872 \ge 0.28</w:t>
       </w:r>
     </w:p>
     <w:p>
+      <w:pPr>
+        <w:spacing w:after="100" w:line="288" w:lineRule="auto"/>
+      </w:pPr>
+      <w:r>
+        <w:t xml:space="preserve">deriving large effect size metrics </w:t>
+      </w:r>
       <w:r>
         <w:rPr>
           <w:rFonts w:ascii="Times New Roman" w:hAnsi="Times New Roman"/>
-          <w:sz w:val="21"/>
+          <w:i/>
+          <w:color w:val="1B365D"/>
         </w:rPr>
-        <w:t>deriving large effect size metrics $\text{Cohen's } f^2 \ge 0.933 &gt; 0.35, \; \text{OR}(\hat{\Omega}_{\text{meta}}) \ge 4.2$. $\blacksquare$</w:t>
+        <w:t>\text{Cohen's } f^2 \ge 0.933 &gt; 0.35, \; \text{OR}(\hat{\Omega}_{\text{meta}}) \ge 4.2</w:t>
       </w:r>
-    </w:p>
-    <w:p>
+      <w:r>
+        <w:t xml:space="preserve">. </w:t>
+      </w:r>
       <w:r>
         <w:rPr>
           <w:rFonts w:ascii="Times New Roman" w:hAnsi="Times New Roman"/>
-          <w:sz w:val="21"/>
+          <w:i/>
+          <w:color w:val="1B365D"/>
         </w:rPr>
-        <w:t>---</w:t>
+        <w:t>\blacksquare</w:t>
       </w:r>
+      <w:r/>
     </w:p>
     <w:p>
+      <w:pPr>
+        <w:spacing w:before="160" w:after="160"/>
+        <w:pBdr>
+          <w:bottom w:val="single" w:sz="6" w:space="1" w:color="D0D7DE"/>
+        </w:pBdr>
+      </w:pPr>
+    </w:p>
+    <w:p>
+      <w:pPr>
+        <w:keepNext/>
+        <w:spacing w:before="320" w:after="160"/>
+        <w:jc w:val="left"/>
+      </w:pPr>
       <w:r>
         <w:rPr>
           <w:rFonts w:ascii="Times New Roman" w:hAnsi="Times New Roman"/>
           <w:b/>
-          <w:color w:val="003366"/>
-          <w:sz w:val="28"/>
+          <w:color w:val="1B365D"/>
+          <w:sz w:val="36"/>
         </w:rPr>
         <w:t>V. Functional Isomorphism Matrix and 4-Tier Falsifiability Decision Tree</w:t>
       </w:r>
     </w:p>
     <w:p>
+      <w:pPr>
+        <w:keepNext/>
+        <w:spacing w:before="280" w:after="120"/>
+      </w:pPr>
       <w:r>
         <w:rPr>
           <w:rFonts w:ascii="Times New Roman" w:hAnsi="Times New Roman"/>
           <w:b/>
-          <w:color w:val="003366"/>
-          <w:sz w:val="24"/>
+          <w:color w:val="1B365D"/>
+          <w:sz w:val="27"/>
         </w:rPr>
         <w:t>5.1 Cross-Layer Functional Isomorphism Matrix</w:t>
-      </w:r>
-    </w:p>
-    <w:p>
-      <w:r>
-        <w:rPr>
-          <w:rFonts w:ascii="Times New Roman" w:hAnsi="Times New Roman"/>
-          <w:b/>
-          <w:color w:val="003366"/>
-          <w:sz w:val="24"/>
-        </w:rPr>
-        <w:t>5.2 4-Tier Falsifiability Decision Tree</w:t>
       </w:r>
     </w:p>
     <w:tbl>
       <w:tblPr>
         <w:tblW w:type="auto" w:w="0"/>
         <w:jc w:val="center"/>
+        <w:tblLayout w:type="fixed"/>
         <w:tblLook w:firstColumn="1" w:firstRow="1" w:lastColumn="0" w:lastRow="0" w:noHBand="0" w:noVBand="1" w:val="04A0"/>
+        <w:tblW w:w="9360" w:type="dxa"/>
+        <w:tblBorders>
+          <w:top w:val="single" w:sz="12" w:space="0" w:color="1B365D"/>
+          <w:bottom w:val="single" w:sz="12" w:space="0" w:color="1B365D"/>
+          <w:insideH w:val="none"/>
+          <w:insideV w:val="none"/>
+          <w:left w:val="none"/>
+          <w:right w:val="none"/>
+        </w:tblBorders>
       </w:tblPr>
       <w:tblGrid>
         <w:gridCol w:w="1560"/>
@@ -719,15 +1676,33 @@
         <w:gridCol w:w="1560"/>
       </w:tblGrid>
       <w:tr>
+        <w:trPr>
+          <w:tblHeader/>
+          <w:cantSplit/>
+        </w:trPr>
         <w:tc>
           <w:tcPr>
-            <w:tcW w:type="dxa" w:w="1560"/>
-            <w:shd w:fill="E6F0FA"/>
+            <w:tcW w:type="dxa" w:w="936"/>
+            <w:tcMar>
+              <w:top w:w="120" w:type="dxa"/>
+              <w:bottom w:w="120" w:type="dxa"/>
+              <w:left w:w="150" w:type="dxa"/>
+              <w:right w:w="150" w:type="dxa"/>
+            </w:tcMar>
+            <w:shd w:fill="F0F4F8"/>
+            <w:tcBorders>
+              <w:bottom w:val="single" w:sz="8" w:space="0" w:color="1B365D"/>
+            </w:tcBorders>
           </w:tcPr>
           <w:p>
+            <w:pPr>
+              <w:jc w:val="center"/>
+            </w:pPr>
             <w:r>
               <w:rPr>
+                <w:rFonts w:ascii="Times New Roman" w:hAnsi="Times New Roman"/>
                 <w:b/>
+                <w:color w:val="1B365D"/>
                 <w:sz w:val="19"/>
               </w:rPr>
               <w:t>Operator</w:t>
@@ -736,13 +1711,27 @@
         </w:tc>
         <w:tc>
           <w:tcPr>
-            <w:tcW w:type="dxa" w:w="1560"/>
-            <w:shd w:fill="E6F0FA"/>
+            <w:tcW w:type="dxa" w:w="1872"/>
+            <w:tcMar>
+              <w:top w:w="120" w:type="dxa"/>
+              <w:bottom w:w="120" w:type="dxa"/>
+              <w:left w:w="150" w:type="dxa"/>
+              <w:right w:w="150" w:type="dxa"/>
+            </w:tcMar>
+            <w:shd w:fill="F0F4F8"/>
+            <w:tcBorders>
+              <w:bottom w:val="single" w:sz="8" w:space="0" w:color="1B365D"/>
+            </w:tcBorders>
           </w:tcPr>
           <w:p>
+            <w:pPr>
+              <w:jc w:val="center"/>
+            </w:pPr>
             <w:r>
               <w:rPr>
+                <w:rFonts w:ascii="Times New Roman" w:hAnsi="Times New Roman"/>
                 <w:b/>
+                <w:color w:val="1B365D"/>
                 <w:sz w:val="19"/>
               </w:rPr>
               <w:t>Neural Hub Node</w:t>
@@ -751,13 +1740,27 @@
         </w:tc>
         <w:tc>
           <w:tcPr>
-            <w:tcW w:type="dxa" w:w="1560"/>
-            <w:shd w:fill="E6F0FA"/>
+            <w:tcW w:type="dxa" w:w="1685"/>
+            <w:tcMar>
+              <w:top w:w="120" w:type="dxa"/>
+              <w:bottom w:w="120" w:type="dxa"/>
+              <w:left w:w="150" w:type="dxa"/>
+              <w:right w:w="150" w:type="dxa"/>
+            </w:tcMar>
+            <w:shd w:fill="F0F4F8"/>
+            <w:tcBorders>
+              <w:bottom w:val="single" w:sz="8" w:space="0" w:color="1B365D"/>
+            </w:tcBorders>
           </w:tcPr>
           <w:p>
+            <w:pPr>
+              <w:jc w:val="center"/>
+            </w:pPr>
             <w:r>
               <w:rPr>
+                <w:rFonts w:ascii="Times New Roman" w:hAnsi="Times New Roman"/>
                 <w:b/>
+                <w:color w:val="1B365D"/>
                 <w:sz w:val="19"/>
               </w:rPr>
               <w:t>Silicon / Engineering Vector</w:t>
@@ -766,13 +1769,27 @@
         </w:tc>
         <w:tc>
           <w:tcPr>
-            <w:tcW w:type="dxa" w:w="1560"/>
-            <w:shd w:fill="E6F0FA"/>
+            <w:tcW w:type="dxa" w:w="1123"/>
+            <w:tcMar>
+              <w:top w:w="120" w:type="dxa"/>
+              <w:bottom w:w="120" w:type="dxa"/>
+              <w:left w:w="150" w:type="dxa"/>
+              <w:right w:w="150" w:type="dxa"/>
+            </w:tcMar>
+            <w:shd w:fill="F0F4F8"/>
+            <w:tcBorders>
+              <w:bottom w:val="single" w:sz="8" w:space="0" w:color="1B365D"/>
+            </w:tcBorders>
           </w:tcPr>
           <w:p>
+            <w:pPr>
+              <w:jc w:val="center"/>
+            </w:pPr>
             <w:r>
               <w:rPr>
+                <w:rFonts w:ascii="Times New Roman" w:hAnsi="Times New Roman"/>
                 <w:b/>
+                <w:color w:val="1B365D"/>
                 <w:sz w:val="19"/>
               </w:rPr>
               <w:t>Philosophical Isomorphism</w:t>
@@ -781,13 +1798,27 @@
         </w:tc>
         <w:tc>
           <w:tcPr>
-            <w:tcW w:type="dxa" w:w="1560"/>
-            <w:shd w:fill="E6F0FA"/>
+            <w:tcW w:type="dxa" w:w="2059"/>
+            <w:tcMar>
+              <w:top w:w="120" w:type="dxa"/>
+              <w:bottom w:w="120" w:type="dxa"/>
+              <w:left w:w="150" w:type="dxa"/>
+              <w:right w:w="150" w:type="dxa"/>
+            </w:tcMar>
+            <w:shd w:fill="F0F4F8"/>
+            <w:tcBorders>
+              <w:bottom w:val="single" w:sz="8" w:space="0" w:color="1B365D"/>
+            </w:tcBorders>
           </w:tcPr>
           <w:p>
+            <w:pPr>
+              <w:jc w:val="center"/>
+            </w:pPr>
             <w:r>
               <w:rPr>
+                <w:rFonts w:ascii="Times New Roman" w:hAnsi="Times New Roman"/>
                 <w:b/>
+                <w:color w:val="1B365D"/>
                 <w:sz w:val="19"/>
               </w:rPr>
               <w:t>Evidence Grade</w:t>
@@ -796,13 +1827,27 @@
         </w:tc>
         <w:tc>
           <w:tcPr>
-            <w:tcW w:type="dxa" w:w="1560"/>
-            <w:shd w:fill="E6F0FA"/>
+            <w:tcW w:type="dxa" w:w="1685"/>
+            <w:tcMar>
+              <w:top w:w="120" w:type="dxa"/>
+              <w:bottom w:w="120" w:type="dxa"/>
+              <w:left w:w="150" w:type="dxa"/>
+              <w:right w:w="150" w:type="dxa"/>
+            </w:tcMar>
+            <w:shd w:fill="F0F4F8"/>
+            <w:tcBorders>
+              <w:bottom w:val="single" w:sz="8" w:space="0" w:color="1B365D"/>
+            </w:tcBorders>
           </w:tcPr>
           <w:p>
+            <w:pPr>
+              <w:jc w:val="center"/>
+            </w:pPr>
             <w:r>
               <w:rPr>
+                <w:rFonts w:ascii="Times New Roman" w:hAnsi="Times New Roman"/>
                 <w:b/>
+                <w:color w:val="1B365D"/>
                 <w:sz w:val="19"/>
               </w:rPr>
               <w:t>Isolation Consequences</w:t>
@@ -811,26 +1856,55 @@
         </w:tc>
       </w:tr>
       <w:tr>
+        <w:trPr>
+          <w:cantSplit/>
+        </w:trPr>
         <w:tc>
           <w:tcPr>
-            <w:tcW w:type="dxa" w:w="1560"/>
+            <w:tcW w:type="dxa" w:w="936"/>
+            <w:tcMar>
+              <w:top w:w="100" w:type="dxa"/>
+              <w:bottom w:w="100" w:type="dxa"/>
+              <w:left w:w="150" w:type="dxa"/>
+              <w:right w:w="150" w:type="dxa"/>
+            </w:tcMar>
+            <w:shd w:fill="FAFCFF"/>
           </w:tcPr>
           <w:p>
+            <w:pPr>
+              <w:spacing w:before="40" w:after="40" w:line="276" w:lineRule="auto"/>
+              <w:jc w:val="left"/>
+            </w:pPr>
             <w:r>
               <w:rPr>
+                <w:rFonts w:ascii="Times New Roman" w:hAnsi="Times New Roman"/>
+                <w:color w:val="282828"/>
                 <w:sz w:val="18"/>
               </w:rPr>
-              <w:t>**$E_{\supp}$**</w:t>
+              <w:t>$E_{\supp}$</w:t>
             </w:r>
           </w:p>
         </w:tc>
         <w:tc>
           <w:tcPr>
-            <w:tcW w:type="dxa" w:w="1560"/>
+            <w:tcW w:type="dxa" w:w="1872"/>
+            <w:tcMar>
+              <w:top w:w="100" w:type="dxa"/>
+              <w:bottom w:w="100" w:type="dxa"/>
+              <w:left w:w="150" w:type="dxa"/>
+              <w:right w:w="150" w:type="dxa"/>
+            </w:tcMar>
+            <w:shd w:fill="FAFCFF"/>
           </w:tcPr>
           <w:p>
+            <w:pPr>
+              <w:spacing w:before="40" w:after="40" w:line="276" w:lineRule="auto"/>
+              <w:jc w:val="center"/>
+            </w:pPr>
             <w:r>
               <w:rPr>
+                <w:rFonts w:ascii="Times New Roman" w:hAnsi="Times New Roman"/>
+                <w:color w:val="282828"/>
                 <w:sz w:val="18"/>
               </w:rPr>
               <w:t>DMN (vmPFC/PCC)</w:t>
@@ -839,11 +1913,24 @@
         </w:tc>
         <w:tc>
           <w:tcPr>
-            <w:tcW w:type="dxa" w:w="1560"/>
+            <w:tcW w:type="dxa" w:w="1685"/>
+            <w:tcMar>
+              <w:top w:w="100" w:type="dxa"/>
+              <w:bottom w:w="100" w:type="dxa"/>
+              <w:left w:w="150" w:type="dxa"/>
+              <w:right w:w="150" w:type="dxa"/>
+            </w:tcMar>
+            <w:shd w:fill="FAFCFF"/>
           </w:tcPr>
           <w:p>
+            <w:pPr>
+              <w:spacing w:before="40" w:after="40" w:line="276" w:lineRule="auto"/>
+              <w:jc w:val="center"/>
+            </w:pPr>
             <w:r>
               <w:rPr>
+                <w:rFonts w:ascii="Times New Roman" w:hAnsi="Times New Roman"/>
+                <w:color w:val="282828"/>
                 <w:sz w:val="18"/>
               </w:rPr>
               <w:t>Hardware Fuse</w:t>
@@ -852,11 +1939,24 @@
         </w:tc>
         <w:tc>
           <w:tcPr>
-            <w:tcW w:type="dxa" w:w="1560"/>
+            <w:tcW w:type="dxa" w:w="1123"/>
+            <w:tcMar>
+              <w:top w:w="100" w:type="dxa"/>
+              <w:bottom w:w="100" w:type="dxa"/>
+              <w:left w:w="150" w:type="dxa"/>
+              <w:right w:w="150" w:type="dxa"/>
+            </w:tcMar>
+            <w:shd w:fill="FAFCFF"/>
           </w:tcPr>
           <w:p>
+            <w:pPr>
+              <w:spacing w:before="40" w:after="40" w:line="276" w:lineRule="auto"/>
+              <w:jc w:val="center"/>
+            </w:pPr>
             <w:r>
               <w:rPr>
+                <w:rFonts w:ascii="Times New Roman" w:hAnsi="Times New Roman"/>
+                <w:color w:val="282828"/>
                 <w:sz w:val="18"/>
               </w:rPr>
               <w:t>Conscience</w:t>
@@ -865,24 +1965,50 @@
         </w:tc>
         <w:tc>
           <w:tcPr>
-            <w:tcW w:type="dxa" w:w="1560"/>
+            <w:tcW w:type="dxa" w:w="2059"/>
+            <w:tcMar>
+              <w:top w:w="100" w:type="dxa"/>
+              <w:bottom w:w="100" w:type="dxa"/>
+              <w:left w:w="150" w:type="dxa"/>
+              <w:right w:w="150" w:type="dxa"/>
+            </w:tcMar>
+            <w:shd w:fill="FAFCFF"/>
           </w:tcPr>
           <w:p>
+            <w:pPr>
+              <w:spacing w:before="40" w:after="40" w:line="276" w:lineRule="auto"/>
+              <w:jc w:val="center"/>
+            </w:pPr>
             <w:r>
               <w:rPr>
+                <w:rFonts w:ascii="Times New Roman" w:hAnsi="Times New Roman"/>
+                <w:color w:val="282828"/>
                 <w:sz w:val="18"/>
               </w:rPr>
-              <w:t>**Grade 2 [Causality] (Resting fMRI + Lesion GSR loss)**</w:t>
+              <w:t>Grade 2 [Causality] (Resting fMRI + Lesion GSR loss)</w:t>
             </w:r>
           </w:p>
         </w:tc>
         <w:tc>
           <w:tcPr>
-            <w:tcW w:type="dxa" w:w="1560"/>
+            <w:tcW w:type="dxa" w:w="1685"/>
+            <w:tcMar>
+              <w:top w:w="100" w:type="dxa"/>
+              <w:bottom w:w="100" w:type="dxa"/>
+              <w:left w:w="150" w:type="dxa"/>
+              <w:right w:w="150" w:type="dxa"/>
+            </w:tcMar>
+            <w:shd w:fill="FAFCFF"/>
           </w:tcPr>
           <w:p>
+            <w:pPr>
+              <w:spacing w:before="40" w:after="40" w:line="276" w:lineRule="auto"/>
+              <w:jc w:val="center"/>
+            </w:pPr>
             <w:r>
               <w:rPr>
+                <w:rFonts w:ascii="Times New Roman" w:hAnsi="Times New Roman"/>
+                <w:color w:val="282828"/>
                 <w:sz w:val="18"/>
               </w:rPr>
               <w:t>Falsifies DMN mapping only</w:t>
@@ -891,26 +2017,55 @@
         </w:tc>
       </w:tr>
       <w:tr>
+        <w:trPr>
+          <w:cantSplit/>
+        </w:trPr>
         <w:tc>
           <w:tcPr>
-            <w:tcW w:type="dxa" w:w="1560"/>
+            <w:tcW w:type="dxa" w:w="936"/>
+            <w:tcMar>
+              <w:top w:w="100" w:type="dxa"/>
+              <w:bottom w:w="100" w:type="dxa"/>
+              <w:left w:w="150" w:type="dxa"/>
+              <w:right w:w="150" w:type="dxa"/>
+            </w:tcMar>
+            <w:shd w:fill="FFFFFF"/>
           </w:tcPr>
           <w:p>
+            <w:pPr>
+              <w:spacing w:before="40" w:after="40" w:line="276" w:lineRule="auto"/>
+              <w:jc w:val="left"/>
+            </w:pPr>
             <w:r>
               <w:rPr>
+                <w:rFonts w:ascii="Times New Roman" w:hAnsi="Times New Roman"/>
+                <w:color w:val="282828"/>
                 <w:sz w:val="18"/>
               </w:rPr>
-              <w:t>**$\nabla R$**</w:t>
+              <w:t>$\nabla R$</w:t>
             </w:r>
           </w:p>
         </w:tc>
         <w:tc>
           <w:tcPr>
-            <w:tcW w:type="dxa" w:w="1560"/>
+            <w:tcW w:type="dxa" w:w="1872"/>
+            <w:tcMar>
+              <w:top w:w="100" w:type="dxa"/>
+              <w:bottom w:w="100" w:type="dxa"/>
+              <w:left w:w="150" w:type="dxa"/>
+              <w:right w:w="150" w:type="dxa"/>
+            </w:tcMar>
+            <w:shd w:fill="FFFFFF"/>
           </w:tcPr>
           <w:p>
+            <w:pPr>
+              <w:spacing w:before="40" w:after="40" w:line="276" w:lineRule="auto"/>
+              <w:jc w:val="center"/>
+            </w:pPr>
             <w:r>
               <w:rPr>
+                <w:rFonts w:ascii="Times New Roman" w:hAnsi="Times New Roman"/>
+                <w:color w:val="282828"/>
                 <w:sz w:val="18"/>
               </w:rPr>
               <w:t>SN (dACC)</w:t>
@@ -919,11 +2074,24 @@
         </w:tc>
         <w:tc>
           <w:tcPr>
-            <w:tcW w:type="dxa" w:w="1560"/>
+            <w:tcW w:type="dxa" w:w="1685"/>
+            <w:tcMar>
+              <w:top w:w="100" w:type="dxa"/>
+              <w:bottom w:w="100" w:type="dxa"/>
+              <w:left w:w="150" w:type="dxa"/>
+              <w:right w:w="150" w:type="dxa"/>
+            </w:tcMar>
+            <w:shd w:fill="FFFFFF"/>
           </w:tcPr>
           <w:p>
+            <w:pPr>
+              <w:spacing w:before="40" w:after="40" w:line="276" w:lineRule="auto"/>
+              <w:jc w:val="center"/>
+            </w:pPr>
             <w:r>
               <w:rPr>
+                <w:rFonts w:ascii="Times New Roman" w:hAnsi="Times New Roman"/>
+                <w:color w:val="282828"/>
                 <w:sz w:val="18"/>
               </w:rPr>
               <w:t>Residual Monitor</w:t>
@@ -932,11 +2100,24 @@
         </w:tc>
         <w:tc>
           <w:tcPr>
-            <w:tcW w:type="dxa" w:w="1560"/>
+            <w:tcW w:type="dxa" w:w="1123"/>
+            <w:tcMar>
+              <w:top w:w="100" w:type="dxa"/>
+              <w:bottom w:w="100" w:type="dxa"/>
+              <w:left w:w="150" w:type="dxa"/>
+              <w:right w:w="150" w:type="dxa"/>
+            </w:tcMar>
+            <w:shd w:fill="FFFFFF"/>
           </w:tcPr>
           <w:p>
+            <w:pPr>
+              <w:spacing w:before="40" w:after="40" w:line="276" w:lineRule="auto"/>
+              <w:jc w:val="center"/>
+            </w:pPr>
             <w:r>
               <w:rPr>
+                <w:rFonts w:ascii="Times New Roman" w:hAnsi="Times New Roman"/>
+                <w:color w:val="282828"/>
                 <w:sz w:val="18"/>
               </w:rPr>
               <w:t>—</w:t>
@@ -945,24 +2126,50 @@
         </w:tc>
         <w:tc>
           <w:tcPr>
-            <w:tcW w:type="dxa" w:w="1560"/>
+            <w:tcW w:type="dxa" w:w="2059"/>
+            <w:tcMar>
+              <w:top w:w="100" w:type="dxa"/>
+              <w:bottom w:w="100" w:type="dxa"/>
+              <w:left w:w="150" w:type="dxa"/>
+              <w:right w:w="150" w:type="dxa"/>
+            </w:tcMar>
+            <w:shd w:fill="FFFFFF"/>
           </w:tcPr>
           <w:p>
+            <w:pPr>
+              <w:spacing w:before="40" w:after="40" w:line="276" w:lineRule="auto"/>
+              <w:jc w:val="center"/>
+            </w:pPr>
             <w:r>
               <w:rPr>
+                <w:rFonts w:ascii="Times New Roman" w:hAnsi="Times New Roman"/>
+                <w:color w:val="282828"/>
                 <w:sz w:val="18"/>
               </w:rPr>
-              <w:t>**Grade 2 [Causality] (ERP/ERN + rTMS suppression)**</w:t>
+              <w:t>Grade 2 [Causality] (ERP/ERN + rTMS suppression)</w:t>
             </w:r>
           </w:p>
         </w:tc>
         <w:tc>
           <w:tcPr>
-            <w:tcW w:type="dxa" w:w="1560"/>
+            <w:tcW w:type="dxa" w:w="1685"/>
+            <w:tcMar>
+              <w:top w:w="100" w:type="dxa"/>
+              <w:bottom w:w="100" w:type="dxa"/>
+              <w:left w:w="150" w:type="dxa"/>
+              <w:right w:w="150" w:type="dxa"/>
+            </w:tcMar>
+            <w:shd w:fill="FFFFFF"/>
           </w:tcPr>
           <w:p>
+            <w:pPr>
+              <w:spacing w:before="40" w:after="40" w:line="276" w:lineRule="auto"/>
+              <w:jc w:val="center"/>
+            </w:pPr>
             <w:r>
               <w:rPr>
+                <w:rFonts w:ascii="Times New Roman" w:hAnsi="Times New Roman"/>
+                <w:color w:val="282828"/>
                 <w:sz w:val="18"/>
               </w:rPr>
               <w:t>Falsifies dACC mapping only</w:t>
@@ -971,26 +2178,55 @@
         </w:tc>
       </w:tr>
       <w:tr>
+        <w:trPr>
+          <w:cantSplit/>
+        </w:trPr>
         <w:tc>
           <w:tcPr>
-            <w:tcW w:type="dxa" w:w="1560"/>
+            <w:tcW w:type="dxa" w:w="936"/>
+            <w:tcMar>
+              <w:top w:w="100" w:type="dxa"/>
+              <w:bottom w:w="100" w:type="dxa"/>
+              <w:left w:w="150" w:type="dxa"/>
+              <w:right w:w="150" w:type="dxa"/>
+            </w:tcMar>
+            <w:shd w:fill="FAFCFF"/>
           </w:tcPr>
           <w:p>
+            <w:pPr>
+              <w:spacing w:before="40" w:after="40" w:line="276" w:lineRule="auto"/>
+              <w:jc w:val="left"/>
+            </w:pPr>
             <w:r>
               <w:rPr>
+                <w:rFonts w:ascii="Times New Roman" w:hAnsi="Times New Roman"/>
+                <w:color w:val="282828"/>
                 <w:sz w:val="18"/>
               </w:rPr>
-              <w:t>**$\mathcal{S}_{\text{buff}}$**</w:t>
+              <w:t>$\mathcal{S}_{\text{buff}}$</w:t>
             </w:r>
           </w:p>
         </w:tc>
         <w:tc>
           <w:tcPr>
-            <w:tcW w:type="dxa" w:w="1560"/>
+            <w:tcW w:type="dxa" w:w="1872"/>
+            <w:tcMar>
+              <w:top w:w="100" w:type="dxa"/>
+              <w:bottom w:w="100" w:type="dxa"/>
+              <w:left w:w="150" w:type="dxa"/>
+              <w:right w:w="150" w:type="dxa"/>
+            </w:tcMar>
+            <w:shd w:fill="FAFCFF"/>
           </w:tcPr>
           <w:p>
+            <w:pPr>
+              <w:spacing w:before="40" w:after="40" w:line="276" w:lineRule="auto"/>
+              <w:jc w:val="center"/>
+            </w:pPr>
             <w:r>
               <w:rPr>
+                <w:rFonts w:ascii="Times New Roman" w:hAnsi="Times New Roman"/>
+                <w:color w:val="282828"/>
                 <w:sz w:val="18"/>
               </w:rPr>
               <w:t>SN (Insula)</w:t>
@@ -999,11 +2235,24 @@
         </w:tc>
         <w:tc>
           <w:tcPr>
-            <w:tcW w:type="dxa" w:w="1560"/>
+            <w:tcW w:type="dxa" w:w="1685"/>
+            <w:tcMar>
+              <w:top w:w="100" w:type="dxa"/>
+              <w:bottom w:w="100" w:type="dxa"/>
+              <w:left w:w="150" w:type="dxa"/>
+              <w:right w:w="150" w:type="dxa"/>
+            </w:tcMar>
+            <w:shd w:fill="FAFCFF"/>
           </w:tcPr>
           <w:p>
+            <w:pPr>
+              <w:spacing w:before="40" w:after="40" w:line="276" w:lineRule="auto"/>
+              <w:jc w:val="center"/>
+            </w:pPr>
             <w:r>
               <w:rPr>
+                <w:rFonts w:ascii="Times New Roman" w:hAnsi="Times New Roman"/>
+                <w:color w:val="282828"/>
                 <w:sz w:val="18"/>
               </w:rPr>
               <w:t>Tacit Buffer</w:t>
@@ -1012,11 +2261,24 @@
         </w:tc>
         <w:tc>
           <w:tcPr>
-            <w:tcW w:type="dxa" w:w="1560"/>
+            <w:tcW w:type="dxa" w:w="1123"/>
+            <w:tcMar>
+              <w:top w:w="100" w:type="dxa"/>
+              <w:bottom w:w="100" w:type="dxa"/>
+              <w:left w:w="150" w:type="dxa"/>
+              <w:right w:w="150" w:type="dxa"/>
+            </w:tcMar>
+            <w:shd w:fill="FAFCFF"/>
           </w:tcPr>
           <w:p>
+            <w:pPr>
+              <w:spacing w:before="40" w:after="40" w:line="276" w:lineRule="auto"/>
+              <w:jc w:val="center"/>
+            </w:pPr>
             <w:r>
               <w:rPr>
+                <w:rFonts w:ascii="Times New Roman" w:hAnsi="Times New Roman"/>
+                <w:color w:val="282828"/>
                 <w:sz w:val="18"/>
               </w:rPr>
               <w:t>—</w:t>
@@ -1025,24 +2287,50 @@
         </w:tc>
         <w:tc>
           <w:tcPr>
-            <w:tcW w:type="dxa" w:w="1560"/>
+            <w:tcW w:type="dxa" w:w="2059"/>
+            <w:tcMar>
+              <w:top w:w="100" w:type="dxa"/>
+              <w:bottom w:w="100" w:type="dxa"/>
+              <w:left w:w="150" w:type="dxa"/>
+              <w:right w:w="150" w:type="dxa"/>
+            </w:tcMar>
+            <w:shd w:fill="FAFCFF"/>
           </w:tcPr>
           <w:p>
+            <w:pPr>
+              <w:spacing w:before="40" w:after="40" w:line="276" w:lineRule="auto"/>
+              <w:jc w:val="center"/>
+            </w:pPr>
             <w:r>
               <w:rPr>
+                <w:rFonts w:ascii="Times New Roman" w:hAnsi="Times New Roman"/>
+                <w:color w:val="282828"/>
                 <w:sz w:val="18"/>
               </w:rPr>
-              <w:t>**Grade 2 [Causality] (Insula stroke + Intuition loss)**</w:t>
+              <w:t>Grade 2 [Causality] (Insula stroke + Intuition loss)</w:t>
             </w:r>
           </w:p>
         </w:tc>
         <w:tc>
           <w:tcPr>
-            <w:tcW w:type="dxa" w:w="1560"/>
+            <w:tcW w:type="dxa" w:w="1685"/>
+            <w:tcMar>
+              <w:top w:w="100" w:type="dxa"/>
+              <w:bottom w:w="100" w:type="dxa"/>
+              <w:left w:w="150" w:type="dxa"/>
+              <w:right w:w="150" w:type="dxa"/>
+            </w:tcMar>
+            <w:shd w:fill="FAFCFF"/>
           </w:tcPr>
           <w:p>
+            <w:pPr>
+              <w:spacing w:before="40" w:after="40" w:line="276" w:lineRule="auto"/>
+              <w:jc w:val="center"/>
+            </w:pPr>
             <w:r>
               <w:rPr>
+                <w:rFonts w:ascii="Times New Roman" w:hAnsi="Times New Roman"/>
+                <w:color w:val="282828"/>
                 <w:sz w:val="18"/>
               </w:rPr>
               <w:t>Falsifies Insula mapping only</w:t>
@@ -1051,26 +2339,55 @@
         </w:tc>
       </w:tr>
       <w:tr>
+        <w:trPr>
+          <w:cantSplit/>
+        </w:trPr>
         <w:tc>
           <w:tcPr>
-            <w:tcW w:type="dxa" w:w="1560"/>
+            <w:tcW w:type="dxa" w:w="936"/>
+            <w:tcMar>
+              <w:top w:w="100" w:type="dxa"/>
+              <w:bottom w:w="100" w:type="dxa"/>
+              <w:left w:w="150" w:type="dxa"/>
+              <w:right w:w="150" w:type="dxa"/>
+            </w:tcMar>
+            <w:shd w:fill="FFFFFF"/>
           </w:tcPr>
           <w:p>
+            <w:pPr>
+              <w:spacing w:before="40" w:after="40" w:line="276" w:lineRule="auto"/>
+              <w:jc w:val="left"/>
+            </w:pPr>
             <w:r>
               <w:rPr>
+                <w:rFonts w:ascii="Times New Roman" w:hAnsi="Times New Roman"/>
+                <w:color w:val="282828"/>
                 <w:sz w:val="18"/>
               </w:rPr>
-              <w:t>**$\hat{\mathcal{A}}_{\text{fluid}}$**</w:t>
+              <w:t>$\hat{\mathcal{A}}_{\text{fluid}}$</w:t>
             </w:r>
           </w:p>
         </w:tc>
         <w:tc>
           <w:tcPr>
-            <w:tcW w:type="dxa" w:w="1560"/>
+            <w:tcW w:type="dxa" w:w="1872"/>
+            <w:tcMar>
+              <w:top w:w="100" w:type="dxa"/>
+              <w:bottom w:w="100" w:type="dxa"/>
+              <w:left w:w="150" w:type="dxa"/>
+              <w:right w:w="150" w:type="dxa"/>
+            </w:tcMar>
+            <w:shd w:fill="FFFFFF"/>
           </w:tcPr>
           <w:p>
+            <w:pPr>
+              <w:spacing w:before="40" w:after="40" w:line="276" w:lineRule="auto"/>
+              <w:jc w:val="center"/>
+            </w:pPr>
             <w:r>
               <w:rPr>
+                <w:rFonts w:ascii="Times New Roman" w:hAnsi="Times New Roman"/>
+                <w:color w:val="282828"/>
                 <w:sz w:val="18"/>
               </w:rPr>
               <w:t>FPN (dlPFC)</w:t>
@@ -1079,11 +2396,24 @@
         </w:tc>
         <w:tc>
           <w:tcPr>
-            <w:tcW w:type="dxa" w:w="1560"/>
+            <w:tcW w:type="dxa" w:w="1685"/>
+            <w:tcMar>
+              <w:top w:w="100" w:type="dxa"/>
+              <w:bottom w:w="100" w:type="dxa"/>
+              <w:left w:w="150" w:type="dxa"/>
+              <w:right w:w="150" w:type="dxa"/>
+            </w:tcMar>
+            <w:shd w:fill="FFFFFF"/>
           </w:tcPr>
           <w:p>
+            <w:pPr>
+              <w:spacing w:before="40" w:after="40" w:line="276" w:lineRule="auto"/>
+              <w:jc w:val="center"/>
+            </w:pPr>
             <w:r>
               <w:rPr>
+                <w:rFonts w:ascii="Times New Roman" w:hAnsi="Times New Roman"/>
+                <w:color w:val="282828"/>
                 <w:sz w:val="18"/>
               </w:rPr>
               <w:t>0-&gt;1 Algebraic Solver</w:t>
@@ -1092,11 +2422,24 @@
         </w:tc>
         <w:tc>
           <w:tcPr>
-            <w:tcW w:type="dxa" w:w="1560"/>
+            <w:tcW w:type="dxa" w:w="1123"/>
+            <w:tcMar>
+              <w:top w:w="100" w:type="dxa"/>
+              <w:bottom w:w="100" w:type="dxa"/>
+              <w:left w:w="150" w:type="dxa"/>
+              <w:right w:w="150" w:type="dxa"/>
+            </w:tcMar>
+            <w:shd w:fill="FFFFFF"/>
           </w:tcPr>
           <w:p>
+            <w:pPr>
+              <w:spacing w:before="40" w:after="40" w:line="276" w:lineRule="auto"/>
+              <w:jc w:val="center"/>
+            </w:pPr>
             <w:r>
               <w:rPr>
+                <w:rFonts w:ascii="Times New Roman" w:hAnsi="Times New Roman"/>
+                <w:color w:val="282828"/>
                 <w:sz w:val="18"/>
               </w:rPr>
               <w:t>—</w:t>
@@ -1105,24 +2448,50 @@
         </w:tc>
         <w:tc>
           <w:tcPr>
-            <w:tcW w:type="dxa" w:w="1560"/>
+            <w:tcW w:type="dxa" w:w="2059"/>
+            <w:tcMar>
+              <w:top w:w="100" w:type="dxa"/>
+              <w:bottom w:w="100" w:type="dxa"/>
+              <w:left w:w="150" w:type="dxa"/>
+              <w:right w:w="150" w:type="dxa"/>
+            </w:tcMar>
+            <w:shd w:fill="FFFFFF"/>
           </w:tcPr>
           <w:p>
+            <w:pPr>
+              <w:spacing w:before="40" w:after="40" w:line="276" w:lineRule="auto"/>
+              <w:jc w:val="center"/>
+            </w:pPr>
             <w:r>
               <w:rPr>
+                <w:rFonts w:ascii="Times New Roman" w:hAnsi="Times New Roman"/>
+                <w:color w:val="282828"/>
                 <w:sz w:val="18"/>
               </w:rPr>
-              <w:t>**Grade 1 [Correlation] (MD-fMRI + Lesion decay)**</w:t>
+              <w:t>Grade 1 [Correlation] (MD-fMRI + Lesion decay)</w:t>
             </w:r>
           </w:p>
         </w:tc>
         <w:tc>
           <w:tcPr>
-            <w:tcW w:type="dxa" w:w="1560"/>
+            <w:tcW w:type="dxa" w:w="1685"/>
+            <w:tcMar>
+              <w:top w:w="100" w:type="dxa"/>
+              <w:bottom w:w="100" w:type="dxa"/>
+              <w:left w:w="150" w:type="dxa"/>
+              <w:right w:w="150" w:type="dxa"/>
+            </w:tcMar>
+            <w:shd w:fill="FFFFFF"/>
           </w:tcPr>
           <w:p>
+            <w:pPr>
+              <w:spacing w:before="40" w:after="40" w:line="276" w:lineRule="auto"/>
+              <w:jc w:val="center"/>
+            </w:pPr>
             <w:r>
               <w:rPr>
+                <w:rFonts w:ascii="Times New Roman" w:hAnsi="Times New Roman"/>
+                <w:color w:val="282828"/>
                 <w:sz w:val="18"/>
               </w:rPr>
               <w:t>Falsifies dlPFC mapping only</w:t>
@@ -1131,26 +2500,55 @@
         </w:tc>
       </w:tr>
       <w:tr>
+        <w:trPr>
+          <w:cantSplit/>
+        </w:trPr>
         <w:tc>
           <w:tcPr>
-            <w:tcW w:type="dxa" w:w="1560"/>
+            <w:tcW w:type="dxa" w:w="936"/>
+            <w:tcMar>
+              <w:top w:w="100" w:type="dxa"/>
+              <w:bottom w:w="100" w:type="dxa"/>
+              <w:left w:w="150" w:type="dxa"/>
+              <w:right w:w="150" w:type="dxa"/>
+            </w:tcMar>
+            <w:shd w:fill="FAFCFF"/>
           </w:tcPr>
           <w:p>
+            <w:pPr>
+              <w:spacing w:before="40" w:after="40" w:line="276" w:lineRule="auto"/>
+              <w:jc w:val="left"/>
+            </w:pPr>
             <w:r>
               <w:rPr>
+                <w:rFonts w:ascii="Times New Roman" w:hAnsi="Times New Roman"/>
+                <w:color w:val="282828"/>
                 <w:sz w:val="18"/>
               </w:rPr>
-              <w:t>**$\hat{\Omega}_{\text{meta}}$**</w:t>
+              <w:t>$\hat{\Omega}_{\text{meta}}$</w:t>
             </w:r>
           </w:p>
         </w:tc>
         <w:tc>
           <w:tcPr>
-            <w:tcW w:type="dxa" w:w="1560"/>
+            <w:tcW w:type="dxa" w:w="1872"/>
+            <w:tcMar>
+              <w:top w:w="100" w:type="dxa"/>
+              <w:bottom w:w="100" w:type="dxa"/>
+              <w:left w:w="150" w:type="dxa"/>
+              <w:right w:w="150" w:type="dxa"/>
+            </w:tcMar>
+            <w:shd w:fill="FAFCFF"/>
           </w:tcPr>
           <w:p>
+            <w:pPr>
+              <w:spacing w:before="40" w:after="40" w:line="276" w:lineRule="auto"/>
+              <w:jc w:val="center"/>
+            </w:pPr>
             <w:r>
               <w:rPr>
+                <w:rFonts w:ascii="Times New Roman" w:hAnsi="Times New Roman"/>
+                <w:color w:val="282828"/>
                 <w:sz w:val="18"/>
               </w:rPr>
               <w:t>rPFC (BA10)</w:t>
@@ -1159,11 +2557,24 @@
         </w:tc>
         <w:tc>
           <w:tcPr>
-            <w:tcW w:type="dxa" w:w="1560"/>
+            <w:tcW w:type="dxa" w:w="1685"/>
+            <w:tcMar>
+              <w:top w:w="100" w:type="dxa"/>
+              <w:bottom w:w="100" w:type="dxa"/>
+              <w:left w:w="150" w:type="dxa"/>
+              <w:right w:w="150" w:type="dxa"/>
+            </w:tcMar>
+            <w:shd w:fill="FAFCFF"/>
           </w:tcPr>
           <w:p>
+            <w:pPr>
+              <w:spacing w:before="40" w:after="40" w:line="276" w:lineRule="auto"/>
+              <w:jc w:val="center"/>
+            </w:pPr>
             <w:r>
               <w:rPr>
+                <w:rFonts w:ascii="Times New Roman" w:hAnsi="Times New Roman"/>
+                <w:color w:val="282828"/>
                 <w:sz w:val="18"/>
               </w:rPr>
               <w:t>WFR Geodesic Jump</w:t>
@@ -1172,11 +2583,24 @@
         </w:tc>
         <w:tc>
           <w:tcPr>
-            <w:tcW w:type="dxa" w:w="1560"/>
+            <w:tcW w:type="dxa" w:w="1123"/>
+            <w:tcMar>
+              <w:top w:w="100" w:type="dxa"/>
+              <w:bottom w:w="100" w:type="dxa"/>
+              <w:left w:w="150" w:type="dxa"/>
+              <w:right w:w="150" w:type="dxa"/>
+            </w:tcMar>
+            <w:shd w:fill="FAFCFF"/>
           </w:tcPr>
           <w:p>
+            <w:pPr>
+              <w:spacing w:before="40" w:after="40" w:line="276" w:lineRule="auto"/>
+              <w:jc w:val="center"/>
+            </w:pPr>
             <w:r>
               <w:rPr>
+                <w:rFonts w:ascii="Times New Roman" w:hAnsi="Times New Roman"/>
+                <w:color w:val="282828"/>
                 <w:sz w:val="18"/>
               </w:rPr>
               <w:t>Extension of Conscience</w:t>
@@ -1185,24 +2609,50 @@
         </w:tc>
         <w:tc>
           <w:tcPr>
-            <w:tcW w:type="dxa" w:w="1560"/>
+            <w:tcW w:type="dxa" w:w="2059"/>
+            <w:tcMar>
+              <w:top w:w="100" w:type="dxa"/>
+              <w:bottom w:w="100" w:type="dxa"/>
+              <w:left w:w="150" w:type="dxa"/>
+              <w:right w:w="150" w:type="dxa"/>
+            </w:tcMar>
+            <w:shd w:fill="FAFCFF"/>
           </w:tcPr>
           <w:p>
+            <w:pPr>
+              <w:spacing w:before="40" w:after="40" w:line="276" w:lineRule="auto"/>
+              <w:jc w:val="center"/>
+            </w:pPr>
             <w:r>
               <w:rPr>
+                <w:rFonts w:ascii="Times New Roman" w:hAnsi="Times New Roman"/>
+                <w:color w:val="282828"/>
                 <w:sz w:val="18"/>
               </w:rPr>
-              <w:t>**Grade 3 [Hypothesis/Prediction] (BA10 + Gamma burst)**</w:t>
+              <w:t>Grade 3 [Hypothesis/Prediction] (BA10 + Gamma burst)</w:t>
             </w:r>
           </w:p>
         </w:tc>
         <w:tc>
           <w:tcPr>
-            <w:tcW w:type="dxa" w:w="1560"/>
+            <w:tcW w:type="dxa" w:w="1685"/>
+            <w:tcMar>
+              <w:top w:w="100" w:type="dxa"/>
+              <w:bottom w:w="100" w:type="dxa"/>
+              <w:left w:w="150" w:type="dxa"/>
+              <w:right w:w="150" w:type="dxa"/>
+            </w:tcMar>
+            <w:shd w:fill="FAFCFF"/>
           </w:tcPr>
           <w:p>
+            <w:pPr>
+              <w:spacing w:before="40" w:after="40" w:line="276" w:lineRule="auto"/>
+              <w:jc w:val="center"/>
+            </w:pPr>
             <w:r>
               <w:rPr>
+                <w:rFonts w:ascii="Times New Roman" w:hAnsi="Times New Roman"/>
+                <w:color w:val="282828"/>
                 <w:sz w:val="18"/>
               </w:rPr>
               <w:t>Falsifies constitutional revision</w:t>
@@ -1211,69 +2661,138 @@
         </w:tc>
       </w:tr>
     </w:tbl>
-    <w:p/>
     <w:p>
-      <w:r>
-        <w:rPr>
-          <w:rFonts w:ascii="Times New Roman" w:hAnsi="Times New Roman"/>
-          <w:sz w:val="21"/>
-        </w:rPr>
-        <w:t>1. **Tier 1 (Neuro-Layer)**: DMN/BA10 lesion compensation only falsifies anatomical localization;</w:t>
-      </w:r>
+      <w:pPr>
+        <w:spacing w:before="80" w:after="120"/>
+      </w:pPr>
     </w:p>
     <w:p>
-      <w:r>
-        <w:rPr>
-          <w:rFonts w:ascii="Times New Roman" w:hAnsi="Times New Roman"/>
-          <w:sz w:val="21"/>
-        </w:rPr>
-        <w:t>2. **Tier 2 (Formal-Layer)**: If 1st-order systems endogenously resolve Gödel deadlocks without revision, $\hat{\Omega}_{\text{meta}}$ necessity is falsified;</w:t>
-      </w:r>
-    </w:p>
-    <w:p>
-      <w:r>
-        <w:rPr>
-          <w:rFonts w:ascii="Times New Roman" w:hAnsi="Times New Roman"/>
-          <w:sz w:val="21"/>
-        </w:rPr>
-        <w:t>3. **Tier 3 (Complexity-Layer)**: If uncompensated 4D subspaces prevent entropy collapse in Non-IID environments, 5D minimality is falsified;</w:t>
-      </w:r>
-    </w:p>
-    <w:p>
-      <w:r>
-        <w:rPr>
-          <w:rFonts w:ascii="Times New Roman" w:hAnsi="Times New Roman"/>
-          <w:sz w:val="21"/>
-        </w:rPr>
-        <w:t>4. **Tier 4 (Engineering-Layer)**: If 5D-Mind-Bench performance on hallucination benchmarks is not superior to software guardrails, engineering increment is falsified.</w:t>
-      </w:r>
-    </w:p>
-    <w:p>
-      <w:r>
-        <w:rPr>
-          <w:rFonts w:ascii="Times New Roman" w:hAnsi="Times New Roman"/>
-          <w:sz w:val="21"/>
-        </w:rPr>
-        <w:t>---</w:t>
-      </w:r>
-    </w:p>
-    <w:p>
+      <w:pPr>
+        <w:keepNext/>
+        <w:spacing w:before="280" w:after="120"/>
+      </w:pPr>
       <w:r>
         <w:rPr>
           <w:rFonts w:ascii="Times New Roman" w:hAnsi="Times New Roman"/>
           <w:b/>
-          <w:color w:val="003366"/>
-          <w:sz w:val="28"/>
+          <w:color w:val="1B365D"/>
+          <w:sz w:val="27"/>
+        </w:rPr>
+        <w:t>5.2 4-Tier Falsifiability Decision Tree</w:t>
+      </w:r>
+    </w:p>
+    <w:p>
+      <w:pPr>
+        <w:spacing w:after="100" w:line="288" w:lineRule="auto"/>
+      </w:pPr>
+      <w:r>
+        <w:t xml:space="preserve">1. </w:t>
+      </w:r>
+      <w:r>
+        <w:rPr>
+          <w:b/>
+          <w:color w:val="1B365D"/>
+        </w:rPr>
+        <w:t>Tier 1 (Neuro-Layer)</w:t>
+      </w:r>
+      <w:r>
+        <w:t>: DMN/BA10 lesion compensation only falsifies anatomical localization;</w:t>
+      </w:r>
+    </w:p>
+    <w:p>
+      <w:pPr>
+        <w:spacing w:after="100" w:line="288" w:lineRule="auto"/>
+      </w:pPr>
+      <w:r>
+        <w:t xml:space="preserve">2. </w:t>
+      </w:r>
+      <w:r>
+        <w:rPr>
+          <w:b/>
+          <w:color w:val="1B365D"/>
+        </w:rPr>
+        <w:t>Tier 2 (Formal-Layer)</w:t>
+      </w:r>
+      <w:r>
+        <w:t xml:space="preserve">: If 1st-order systems endogenously resolve Gödel deadlocks without revision, </w:t>
+      </w:r>
+      <w:r>
+        <w:rPr>
+          <w:rFonts w:ascii="Times New Roman" w:hAnsi="Times New Roman"/>
+          <w:i/>
+          <w:color w:val="1B365D"/>
+        </w:rPr>
+        <w:t>\hat{\Omega}_{\text{meta}}</w:t>
+      </w:r>
+      <w:r>
+        <w:t xml:space="preserve"> necessity is falsified;</w:t>
+      </w:r>
+    </w:p>
+    <w:p>
+      <w:pPr>
+        <w:spacing w:after="100" w:line="288" w:lineRule="auto"/>
+      </w:pPr>
+      <w:r>
+        <w:t xml:space="preserve">3. </w:t>
+      </w:r>
+      <w:r>
+        <w:rPr>
+          <w:b/>
+          <w:color w:val="1B365D"/>
+        </w:rPr>
+        <w:t>Tier 3 (Complexity-Layer)</w:t>
+      </w:r>
+      <w:r>
+        <w:t>: If uncompensated 4D subspaces prevent entropy collapse in Non-IID environments, 5D minimality is falsified;</w:t>
+      </w:r>
+    </w:p>
+    <w:p>
+      <w:pPr>
+        <w:spacing w:after="100" w:line="288" w:lineRule="auto"/>
+      </w:pPr>
+      <w:r>
+        <w:t xml:space="preserve">4. </w:t>
+      </w:r>
+      <w:r>
+        <w:rPr>
+          <w:b/>
+          <w:color w:val="1B365D"/>
+        </w:rPr>
+        <w:t>Tier 4 (Engineering-Layer)</w:t>
+      </w:r>
+      <w:r>
+        <w:t>: If 5D-Mind-Bench performance on hallucination benchmarks is not superior to software guardrails, engineering increment is falsified.</w:t>
+      </w:r>
+    </w:p>
+    <w:p>
+      <w:pPr>
+        <w:spacing w:before="160" w:after="160"/>
+        <w:pBdr>
+          <w:bottom w:val="single" w:sz="6" w:space="1" w:color="D0D7DE"/>
+        </w:pBdr>
+      </w:pPr>
+    </w:p>
+    <w:p>
+      <w:pPr>
+        <w:keepNext/>
+        <w:spacing w:before="320" w:after="160"/>
+        <w:jc w:val="left"/>
+      </w:pPr>
+      <w:r>
+        <w:rPr>
+          <w:rFonts w:ascii="Times New Roman" w:hAnsi="Times New Roman"/>
+          <w:b/>
+          <w:color w:val="1B365D"/>
+          <w:sz w:val="36"/>
         </w:rPr>
         <w:t>VI. Benchmark Harness and Empirical Validation on 5D-Mind-Bench</w:t>
       </w:r>
     </w:p>
     <w:p>
+      <w:pPr>
+        <w:spacing w:after="100" w:line="288" w:lineRule="auto"/>
+      </w:pPr>
       <w:r>
-        <w:rPr>
-          <w:rFonts w:ascii="Times New Roman" w:hAnsi="Times New Roman"/>
-          <w:sz w:val="21"/>
-        </w:rPr>
         <w:t>Benchmark comparison on 1,000 OOD logic loop traps:</w:t>
       </w:r>
     </w:p>
@@ -1281,7 +2800,17 @@
       <w:tblPr>
         <w:tblW w:type="auto" w:w="0"/>
         <w:jc w:val="center"/>
+        <w:tblLayout w:type="fixed"/>
         <w:tblLook w:firstColumn="1" w:firstRow="1" w:lastColumn="0" w:lastRow="0" w:noHBand="0" w:noVBand="1" w:val="04A0"/>
+        <w:tblW w:w="9360" w:type="dxa"/>
+        <w:tblBorders>
+          <w:top w:val="single" w:sz="12" w:space="0" w:color="1B365D"/>
+          <w:bottom w:val="single" w:sz="12" w:space="0" w:color="1B365D"/>
+          <w:insideH w:val="none"/>
+          <w:insideV w:val="none"/>
+          <w:left w:val="none"/>
+          <w:right w:val="none"/>
+        </w:tblBorders>
       </w:tblPr>
       <w:tblGrid>
         <w:gridCol w:w="2340"/>
@@ -1290,15 +2819,33 @@
         <w:gridCol w:w="2340"/>
       </w:tblGrid>
       <w:tr>
+        <w:trPr>
+          <w:tblHeader/>
+          <w:cantSplit/>
+        </w:trPr>
         <w:tc>
           <w:tcPr>
-            <w:tcW w:type="dxa" w:w="2340"/>
-            <w:shd w:fill="E6F0FA"/>
+            <w:tcW w:type="dxa" w:w="3276"/>
+            <w:tcMar>
+              <w:top w:w="120" w:type="dxa"/>
+              <w:bottom w:w="120" w:type="dxa"/>
+              <w:left w:w="150" w:type="dxa"/>
+              <w:right w:w="150" w:type="dxa"/>
+            </w:tcMar>
+            <w:shd w:fill="F0F4F8"/>
+            <w:tcBorders>
+              <w:bottom w:val="single" w:sz="8" w:space="0" w:color="1B365D"/>
+            </w:tcBorders>
           </w:tcPr>
           <w:p>
+            <w:pPr>
+              <w:jc w:val="center"/>
+            </w:pPr>
             <w:r>
               <w:rPr>
+                <w:rFonts w:ascii="Times New Roman" w:hAnsi="Times New Roman"/>
                 <w:b/>
+                <w:color w:val="1B365D"/>
                 <w:sz w:val="19"/>
               </w:rPr>
               <w:t>Cognitive Architecture / Fuse Scheme</w:t>
@@ -1307,13 +2854,27 @@
         </w:tc>
         <w:tc>
           <w:tcPr>
-            <w:tcW w:type="dxa" w:w="2340"/>
-            <w:shd w:fill="E6F0FA"/>
+            <w:tcW w:type="dxa" w:w="1872"/>
+            <w:tcMar>
+              <w:top w:w="120" w:type="dxa"/>
+              <w:bottom w:w="120" w:type="dxa"/>
+              <w:left w:w="150" w:type="dxa"/>
+              <w:right w:w="150" w:type="dxa"/>
+            </w:tcMar>
+            <w:shd w:fill="F0F4F8"/>
+            <w:tcBorders>
+              <w:bottom w:val="single" w:sz="8" w:space="0" w:color="1B365D"/>
+            </w:tcBorders>
           </w:tcPr>
           <w:p>
+            <w:pPr>
+              <w:jc w:val="center"/>
+            </w:pPr>
             <w:r>
               <w:rPr>
+                <w:rFonts w:ascii="Times New Roman" w:hAnsi="Times New Roman"/>
                 <w:b/>
+                <w:color w:val="1B365D"/>
                 <w:sz w:val="19"/>
               </w:rPr>
               <w:t>Truncation Rate</w:t>
@@ -1322,13 +2883,27 @@
         </w:tc>
         <w:tc>
           <w:tcPr>
-            <w:tcW w:type="dxa" w:w="2340"/>
-            <w:shd w:fill="E6F0FA"/>
+            <w:tcW w:type="dxa" w:w="2153"/>
+            <w:tcMar>
+              <w:top w:w="120" w:type="dxa"/>
+              <w:bottom w:w="120" w:type="dxa"/>
+              <w:left w:w="150" w:type="dxa"/>
+              <w:right w:w="150" w:type="dxa"/>
+            </w:tcMar>
+            <w:shd w:fill="F0F4F8"/>
+            <w:tcBorders>
+              <w:bottom w:val="single" w:sz="8" w:space="0" w:color="1B365D"/>
+            </w:tcBorders>
           </w:tcPr>
           <w:p>
+            <w:pPr>
+              <w:jc w:val="center"/>
+            </w:pPr>
             <w:r>
               <w:rPr>
+                <w:rFonts w:ascii="Times New Roman" w:hAnsi="Times New Roman"/>
                 <w:b/>
+                <w:color w:val="1B365D"/>
                 <w:sz w:val="19"/>
               </w:rPr>
               <w:t>False Positive Rate</w:t>
@@ -1337,13 +2912,27 @@
         </w:tc>
         <w:tc>
           <w:tcPr>
-            <w:tcW w:type="dxa" w:w="2340"/>
-            <w:shd w:fill="E6F0FA"/>
+            <w:tcW w:type="dxa" w:w="2059"/>
+            <w:tcMar>
+              <w:top w:w="120" w:type="dxa"/>
+              <w:bottom w:w="120" w:type="dxa"/>
+              <w:left w:w="150" w:type="dxa"/>
+              <w:right w:w="150" w:type="dxa"/>
+            </w:tcMar>
+            <w:shd w:fill="F0F4F8"/>
+            <w:tcBorders>
+              <w:bottom w:val="single" w:sz="8" w:space="0" w:color="1B365D"/>
+            </w:tcBorders>
           </w:tcPr>
           <w:p>
+            <w:pPr>
+              <w:jc w:val="center"/>
+            </w:pPr>
             <w:r>
               <w:rPr>
+                <w:rFonts w:ascii="Times New Roman" w:hAnsi="Times New Roman"/>
                 <w:b/>
+                <w:color w:val="1B365D"/>
                 <w:sz w:val="19"/>
               </w:rPr>
               <w:t>OOD Meta-Jump Rate</w:t>
@@ -1352,26 +2941,55 @@
         </w:tc>
       </w:tr>
       <w:tr>
+        <w:trPr>
+          <w:cantSplit/>
+        </w:trPr>
         <w:tc>
           <w:tcPr>
-            <w:tcW w:type="dxa" w:w="2340"/>
+            <w:tcW w:type="dxa" w:w="3276"/>
+            <w:tcMar>
+              <w:top w:w="100" w:type="dxa"/>
+              <w:bottom w:w="100" w:type="dxa"/>
+              <w:left w:w="150" w:type="dxa"/>
+              <w:right w:w="150" w:type="dxa"/>
+            </w:tcMar>
+            <w:shd w:fill="FAFCFF"/>
           </w:tcPr>
           <w:p>
+            <w:pPr>
+              <w:spacing w:before="40" w:after="40" w:line="276" w:lineRule="auto"/>
+              <w:jc w:val="left"/>
+            </w:pPr>
             <w:r>
               <w:rPr>
+                <w:rFonts w:ascii="Times New Roman" w:hAnsi="Times New Roman"/>
+                <w:color w:val="282828"/>
                 <w:sz w:val="18"/>
               </w:rPr>
-              <w:t>**Traditional Software Guardrails**</w:t>
+              <w:t>Traditional Software Guardrails</w:t>
             </w:r>
           </w:p>
         </w:tc>
         <w:tc>
           <w:tcPr>
-            <w:tcW w:type="dxa" w:w="2340"/>
+            <w:tcW w:type="dxa" w:w="1872"/>
+            <w:tcMar>
+              <w:top w:w="100" w:type="dxa"/>
+              <w:bottom w:w="100" w:type="dxa"/>
+              <w:left w:w="150" w:type="dxa"/>
+              <w:right w:w="150" w:type="dxa"/>
+            </w:tcMar>
+            <w:shd w:fill="FAFCFF"/>
           </w:tcPr>
           <w:p>
+            <w:pPr>
+              <w:spacing w:before="40" w:after="40" w:line="276" w:lineRule="auto"/>
+              <w:jc w:val="center"/>
+            </w:pPr>
             <w:r>
               <w:rPr>
+                <w:rFonts w:ascii="Times New Roman" w:hAnsi="Times New Roman"/>
+                <w:color w:val="282828"/>
                 <w:sz w:val="18"/>
               </w:rPr>
               <w:t>42.5%</w:t>
@@ -1380,11 +2998,24 @@
         </w:tc>
         <w:tc>
           <w:tcPr>
-            <w:tcW w:type="dxa" w:w="2340"/>
+            <w:tcW w:type="dxa" w:w="2153"/>
+            <w:tcMar>
+              <w:top w:w="100" w:type="dxa"/>
+              <w:bottom w:w="100" w:type="dxa"/>
+              <w:left w:w="150" w:type="dxa"/>
+              <w:right w:w="150" w:type="dxa"/>
+            </w:tcMar>
+            <w:shd w:fill="FAFCFF"/>
           </w:tcPr>
           <w:p>
+            <w:pPr>
+              <w:spacing w:before="40" w:after="40" w:line="276" w:lineRule="auto"/>
+              <w:jc w:val="center"/>
+            </w:pPr>
             <w:r>
               <w:rPr>
+                <w:rFonts w:ascii="Times New Roman" w:hAnsi="Times New Roman"/>
+                <w:color w:val="282828"/>
                 <w:sz w:val="18"/>
               </w:rPr>
               <w:t>14.8%</w:t>
@@ -1393,11 +3024,24 @@
         </w:tc>
         <w:tc>
           <w:tcPr>
-            <w:tcW w:type="dxa" w:w="2340"/>
+            <w:tcW w:type="dxa" w:w="2059"/>
+            <w:tcMar>
+              <w:top w:w="100" w:type="dxa"/>
+              <w:bottom w:w="100" w:type="dxa"/>
+              <w:left w:w="150" w:type="dxa"/>
+              <w:right w:w="150" w:type="dxa"/>
+            </w:tcMar>
+            <w:shd w:fill="FAFCFF"/>
           </w:tcPr>
           <w:p>
+            <w:pPr>
+              <w:spacing w:before="40" w:after="40" w:line="276" w:lineRule="auto"/>
+              <w:jc w:val="center"/>
+            </w:pPr>
             <w:r>
               <w:rPr>
+                <w:rFonts w:ascii="Times New Roman" w:hAnsi="Times New Roman"/>
+                <w:color w:val="282828"/>
                 <w:sz w:val="18"/>
               </w:rPr>
               <w:t>0.0%</w:t>
@@ -1406,87 +3050,149 @@
         </w:tc>
       </w:tr>
       <w:tr>
+        <w:trPr>
+          <w:cantSplit/>
+        </w:trPr>
         <w:tc>
           <w:tcPr>
-            <w:tcW w:type="dxa" w:w="2340"/>
+            <w:tcW w:type="dxa" w:w="3276"/>
+            <w:tcMar>
+              <w:top w:w="100" w:type="dxa"/>
+              <w:bottom w:w="100" w:type="dxa"/>
+              <w:left w:w="150" w:type="dxa"/>
+              <w:right w:w="150" w:type="dxa"/>
+            </w:tcMar>
+            <w:shd w:fill="FFFFFF"/>
           </w:tcPr>
           <w:p>
+            <w:pPr>
+              <w:spacing w:before="40" w:after="40" w:line="276" w:lineRule="auto"/>
+              <w:jc w:val="left"/>
+            </w:pPr>
             <w:r>
               <w:rPr>
+                <w:rFonts w:ascii="Times New Roman" w:hAnsi="Times New Roman"/>
+                <w:color w:val="282828"/>
                 <w:sz w:val="18"/>
               </w:rPr>
-              <w:t>**5D Hardware Fuse Topology**</w:t>
+              <w:t>5D Hardware Fuse Topology</w:t>
             </w:r>
           </w:p>
         </w:tc>
         <w:tc>
           <w:tcPr>
-            <w:tcW w:type="dxa" w:w="2340"/>
+            <w:tcW w:type="dxa" w:w="1872"/>
+            <w:tcMar>
+              <w:top w:w="100" w:type="dxa"/>
+              <w:bottom w:w="100" w:type="dxa"/>
+              <w:left w:w="150" w:type="dxa"/>
+              <w:right w:w="150" w:type="dxa"/>
+            </w:tcMar>
+            <w:shd w:fill="FFFFFF"/>
           </w:tcPr>
           <w:p>
+            <w:pPr>
+              <w:spacing w:before="40" w:after="40" w:line="276" w:lineRule="auto"/>
+              <w:jc w:val="center"/>
+            </w:pPr>
             <w:r>
               <w:rPr>
+                <w:rFonts w:ascii="Times New Roman" w:hAnsi="Times New Roman"/>
+                <w:color w:val="282828"/>
                 <w:sz w:val="18"/>
               </w:rPr>
-              <w:t>**96.8%**</w:t>
+              <w:t>96.8%</w:t>
             </w:r>
           </w:p>
         </w:tc>
         <w:tc>
           <w:tcPr>
-            <w:tcW w:type="dxa" w:w="2340"/>
+            <w:tcW w:type="dxa" w:w="2153"/>
+            <w:tcMar>
+              <w:top w:w="100" w:type="dxa"/>
+              <w:bottom w:w="100" w:type="dxa"/>
+              <w:left w:w="150" w:type="dxa"/>
+              <w:right w:w="150" w:type="dxa"/>
+            </w:tcMar>
+            <w:shd w:fill="FFFFFF"/>
           </w:tcPr>
           <w:p>
+            <w:pPr>
+              <w:spacing w:before="40" w:after="40" w:line="276" w:lineRule="auto"/>
+              <w:jc w:val="center"/>
+            </w:pPr>
             <w:r>
               <w:rPr>
+                <w:rFonts w:ascii="Times New Roman" w:hAnsi="Times New Roman"/>
+                <w:color w:val="282828"/>
                 <w:sz w:val="18"/>
               </w:rPr>
-              <w:t>**&lt;1.5%**</w:t>
+              <w:t>&lt;1.5%</w:t>
             </w:r>
           </w:p>
         </w:tc>
         <w:tc>
           <w:tcPr>
-            <w:tcW w:type="dxa" w:w="2340"/>
+            <w:tcW w:type="dxa" w:w="2059"/>
+            <w:tcMar>
+              <w:top w:w="100" w:type="dxa"/>
+              <w:bottom w:w="100" w:type="dxa"/>
+              <w:left w:w="150" w:type="dxa"/>
+              <w:right w:w="150" w:type="dxa"/>
+            </w:tcMar>
+            <w:shd w:fill="FFFFFF"/>
           </w:tcPr>
           <w:p>
+            <w:pPr>
+              <w:spacing w:before="40" w:after="40" w:line="276" w:lineRule="auto"/>
+              <w:jc w:val="center"/>
+            </w:pPr>
             <w:r>
               <w:rPr>
+                <w:rFonts w:ascii="Times New Roman" w:hAnsi="Times New Roman"/>
+                <w:color w:val="282828"/>
                 <w:sz w:val="18"/>
               </w:rPr>
-              <w:t>**88.4%**</w:t>
+              <w:t>88.4%</w:t>
             </w:r>
           </w:p>
         </w:tc>
       </w:tr>
     </w:tbl>
-    <w:p/>
     <w:p>
-      <w:r>
-        <w:rPr>
-          <w:rFonts w:ascii="Times New Roman" w:hAnsi="Times New Roman"/>
-          <w:sz w:val="21"/>
-        </w:rPr>
-        <w:t>---</w:t>
-      </w:r>
+      <w:pPr>
+        <w:spacing w:before="80" w:after="120"/>
+      </w:pPr>
     </w:p>
     <w:p>
+      <w:pPr>
+        <w:spacing w:before="160" w:after="160"/>
+        <w:pBdr>
+          <w:bottom w:val="single" w:sz="6" w:space="1" w:color="D0D7DE"/>
+        </w:pBdr>
+      </w:pPr>
+    </w:p>
+    <w:p>
+      <w:pPr>
+        <w:keepNext/>
+        <w:spacing w:before="320" w:after="160"/>
+        <w:jc w:val="left"/>
+      </w:pPr>
       <w:r>
         <w:rPr>
           <w:rFonts w:ascii="Times New Roman" w:hAnsi="Times New Roman"/>
           <w:b/>
-          <w:color w:val="003366"/>
-          <w:sz w:val="28"/>
+          <w:color w:val="1B365D"/>
+          <w:sz w:val="36"/>
         </w:rPr>
         <w:t>VII. Conclusion</w:t>
       </w:r>
     </w:p>
     <w:p>
+      <w:pPr>
+        <w:spacing w:after="100" w:line="288" w:lineRule="auto"/>
+      </w:pPr>
       <w:r>
-        <w:rPr>
-          <w:rFonts w:ascii="Times New Roman" w:hAnsi="Times New Roman"/>
-          <w:sz w:val="21"/>
-        </w:rPr>
         <w:t>The 2nd-order cybernetic architecture and 5D Mind Model establish a complete, self-consistent framework bridging Gödel deadlock anomalies, Ashby minimality proofs, hybrid automaton formalizations, and multi-tier empirical falsifiability.</w:t>
       </w:r>
     </w:p>
@@ -1863,9 +3569,12 @@
     <w:name w:val="Normal"/>
     <w:qFormat/>
     <w:rsid w:val="00FC693F"/>
+    <w:pPr>
+      <w:spacing w:line="288" w:lineRule="auto" w:after="100"/>
+    </w:pPr>
     <w:rPr>
       <w:rFonts w:ascii="Times New Roman" w:hAnsi="Times New Roman"/>
-      <w:color w:val="222222"/>
+      <w:color w:val="282828"/>
       <w:sz w:val="21"/>
     </w:rPr>
   </w:style>

</xml_diff>